<commit_message>
Added the Milestone Schedule
Made a table for the milestone schedule and added the made issues to the schedule.
</commit_message>
<xml_diff>
--- a/Project Plan - Team4.docx
+++ b/Project Plan - Team4.docx
@@ -114,7 +114,23 @@
     </w:p>
     <w:p>
       <w:r>
-        <w:t>Our team meets twice weekly in person during 3444.002 (Mondays and Wednesdays).  Additionally, the team is connected via Discord and can meet virtually for any additional requirements.  The project files are centrally-located on GitHub.</w:t>
+        <w:t xml:space="preserve">Our team meets twice weekly in person during 3444.002 (Mondays and Wednesdays).  Additionally, the team is connected via Discord and can meet </w:t>
+      </w:r>
+      <w:proofErr w:type="gramStart"/>
+      <w:r>
+        <w:t>virtually for</w:t>
+      </w:r>
+      <w:proofErr w:type="gramEnd"/>
+      <w:r>
+        <w:t xml:space="preserve"> any additional requirements.  The project files are </w:t>
+      </w:r>
+      <w:proofErr w:type="gramStart"/>
+      <w:r>
+        <w:t>centrally-located</w:t>
+      </w:r>
+      <w:proofErr w:type="gramEnd"/>
+      <w:r>
+        <w:t xml:space="preserve"> on GitHub.</w:t>
       </w:r>
     </w:p>
     <w:p>
@@ -138,11 +154,20 @@
           <w:b/>
           <w:bCs/>
         </w:rPr>
-        <w:t xml:space="preserve">Operating System:  </w:t>
+        <w:t>Operating System</w:t>
+      </w:r>
+      <w:proofErr w:type="gramStart"/>
+      <w:r>
+        <w:rPr>
+          <w:b/>
+          <w:bCs/>
+        </w:rPr>
+        <w:t xml:space="preserve">:  </w:t>
       </w:r>
       <w:r>
         <w:t>Windows</w:t>
       </w:r>
+      <w:proofErr w:type="gramEnd"/>
     </w:p>
     <w:p>
       <w:pPr>
@@ -192,10 +217,22 @@
           <w:b/>
           <w:bCs/>
         </w:rPr>
-        <w:t xml:space="preserve">Sharing Tool:  </w:t>
-      </w:r>
-      <w:r>
-        <w:t>GitHub, Discord</w:t>
+        <w:t>Sharing Tool</w:t>
+      </w:r>
+      <w:proofErr w:type="gramStart"/>
+      <w:r>
+        <w:rPr>
+          <w:b/>
+          <w:bCs/>
+        </w:rPr>
+        <w:t xml:space="preserve">:  </w:t>
+      </w:r>
+      <w:r>
+        <w:t>GitHub</w:t>
+      </w:r>
+      <w:proofErr w:type="gramEnd"/>
+      <w:r>
+        <w:t>, Discord</w:t>
       </w:r>
     </w:p>
     <w:p>
@@ -211,11 +248,22 @@
           <w:b/>
           <w:bCs/>
         </w:rPr>
-        <w:t xml:space="preserve">Modelling Tool:  </w:t>
-      </w:r>
+        <w:t>Modelling Tool</w:t>
+      </w:r>
+      <w:proofErr w:type="gramStart"/>
+      <w:r>
+        <w:rPr>
+          <w:b/>
+          <w:bCs/>
+        </w:rPr>
+        <w:t xml:space="preserve">:  </w:t>
+      </w:r>
+      <w:proofErr w:type="spellStart"/>
       <w:r>
         <w:t>Lucidchart</w:t>
       </w:r>
+      <w:proofErr w:type="spellEnd"/>
+      <w:proofErr w:type="gramEnd"/>
     </w:p>
     <w:p>
       <w:pPr>
@@ -249,11 +297,20 @@
           <w:b/>
           <w:bCs/>
         </w:rPr>
-        <w:t xml:space="preserve">Database:  </w:t>
+        <w:t>Database</w:t>
+      </w:r>
+      <w:proofErr w:type="gramStart"/>
+      <w:r>
+        <w:rPr>
+          <w:b/>
+          <w:bCs/>
+        </w:rPr>
+        <w:t xml:space="preserve">:  </w:t>
       </w:r>
       <w:r>
         <w:t>SQLite</w:t>
       </w:r>
+      <w:proofErr w:type="gramEnd"/>
     </w:p>
     <w:p>
       <w:pPr>
@@ -270,6 +327,7 @@
         </w:rPr>
         <w:t>Version Control</w:t>
       </w:r>
+      <w:proofErr w:type="gramStart"/>
       <w:r>
         <w:rPr>
           <w:b/>
@@ -287,6 +345,7 @@
       <w:r>
         <w:t>GitHub</w:t>
       </w:r>
+      <w:proofErr w:type="gramEnd"/>
       <w:r>
         <w:rPr>
           <w:b/>
@@ -306,10 +365,501 @@
       <w:pPr>
         <w:pStyle w:val="Subtitle"/>
       </w:pPr>
-      <w:r>
+    </w:p>
+    <w:p>
+      <w:pPr>
+        <w:pStyle w:val="Subtitle"/>
+      </w:pPr>
+      <w:r>
+        <w:lastRenderedPageBreak/>
         <w:t>Milestone Schedule</w:t>
       </w:r>
     </w:p>
+    <w:tbl>
+      <w:tblPr>
+        <w:tblStyle w:val="TableGrid"/>
+        <w:tblW w:w="9180" w:type="dxa"/>
+        <w:tblInd w:w="-95" w:type="dxa"/>
+        <w:tblLook w:val="04A0" w:firstRow="1" w:lastRow="0" w:firstColumn="1" w:lastColumn="0" w:noHBand="0" w:noVBand="1"/>
+      </w:tblPr>
+      <w:tblGrid>
+        <w:gridCol w:w="4642"/>
+        <w:gridCol w:w="1278"/>
+        <w:gridCol w:w="1681"/>
+        <w:gridCol w:w="1579"/>
+      </w:tblGrid>
+      <w:tr>
+        <w:tc>
+          <w:tcPr>
+            <w:tcW w:w="4719" w:type="dxa"/>
+            <w:shd w:val="clear" w:color="auto" w:fill="4EA72E" w:themeFill="accent6"/>
+          </w:tcPr>
+          <w:p>
+            <w:pPr>
+              <w:rPr>
+                <w:b/>
+                <w:bCs/>
+                <w:color w:val="FFFFFF" w:themeColor="background1"/>
+              </w:rPr>
+            </w:pPr>
+            <w:r>
+              <w:rPr>
+                <w:b/>
+                <w:bCs/>
+                <w:color w:val="FFFFFF" w:themeColor="background1"/>
+              </w:rPr>
+              <w:t>Milestone</w:t>
+            </w:r>
+          </w:p>
+        </w:tc>
+        <w:tc>
+          <w:tcPr>
+            <w:tcW w:w="1291" w:type="dxa"/>
+            <w:shd w:val="clear" w:color="auto" w:fill="4EA72E" w:themeFill="accent6"/>
+          </w:tcPr>
+          <w:p>
+            <w:pPr>
+              <w:rPr>
+                <w:b/>
+                <w:bCs/>
+                <w:color w:val="FFFFFF" w:themeColor="background1"/>
+              </w:rPr>
+            </w:pPr>
+            <w:r>
+              <w:rPr>
+                <w:b/>
+                <w:bCs/>
+                <w:color w:val="FFFFFF" w:themeColor="background1"/>
+              </w:rPr>
+              <w:t>Due Date</w:t>
+            </w:r>
+          </w:p>
+        </w:tc>
+        <w:tc>
+          <w:tcPr>
+            <w:tcW w:w="1681" w:type="dxa"/>
+            <w:shd w:val="clear" w:color="auto" w:fill="4EA72E" w:themeFill="accent6"/>
+          </w:tcPr>
+          <w:p>
+            <w:pPr>
+              <w:tabs>
+                <w:tab w:val="right" w:pos="2342"/>
+              </w:tabs>
+              <w:rPr>
+                <w:b/>
+                <w:bCs/>
+                <w:color w:val="FFFFFF" w:themeColor="background1"/>
+              </w:rPr>
+            </w:pPr>
+            <w:r>
+              <w:rPr>
+                <w:b/>
+                <w:bCs/>
+                <w:color w:val="FFFFFF" w:themeColor="background1"/>
+              </w:rPr>
+              <w:t>Release</w:t>
+            </w:r>
+            <w:r>
+              <w:rPr>
+                <w:b/>
+                <w:bCs/>
+                <w:color w:val="FFFFFF" w:themeColor="background1"/>
+              </w:rPr>
+              <w:tab/>
+            </w:r>
+          </w:p>
+        </w:tc>
+        <w:tc>
+          <w:tcPr>
+            <w:tcW w:w="1489" w:type="dxa"/>
+            <w:shd w:val="clear" w:color="auto" w:fill="4EA72E" w:themeFill="accent6"/>
+          </w:tcPr>
+          <w:p>
+            <w:pPr>
+              <w:rPr>
+                <w:b/>
+                <w:bCs/>
+                <w:color w:val="FFFFFF" w:themeColor="background1"/>
+              </w:rPr>
+            </w:pPr>
+            <w:r>
+              <w:rPr>
+                <w:b/>
+                <w:bCs/>
+                <w:color w:val="FFFFFF" w:themeColor="background1"/>
+              </w:rPr>
+              <w:t>Deliverable?</w:t>
+            </w:r>
+          </w:p>
+        </w:tc>
+      </w:tr>
+      <w:tr>
+        <w:tc>
+          <w:tcPr>
+            <w:tcW w:w="4719" w:type="dxa"/>
+          </w:tcPr>
+          <w:p>
+            <w:r>
+              <w:t>Design Document</w:t>
+            </w:r>
+          </w:p>
+        </w:tc>
+        <w:tc>
+          <w:tcPr>
+            <w:tcW w:w="1291" w:type="dxa"/>
+          </w:tcPr>
+          <w:p>
+            <w:r>
+              <w:t>TBD</w:t>
+            </w:r>
+          </w:p>
+        </w:tc>
+        <w:tc>
+          <w:tcPr>
+            <w:tcW w:w="1681" w:type="dxa"/>
+          </w:tcPr>
+          <w:p>
+            <w:r>
+              <w:t>Phase 1</w:t>
+            </w:r>
+          </w:p>
+        </w:tc>
+        <w:tc>
+          <w:tcPr>
+            <w:tcW w:w="1489" w:type="dxa"/>
+          </w:tcPr>
+          <w:p/>
+        </w:tc>
+      </w:tr>
+      <w:tr>
+        <w:tc>
+          <w:tcPr>
+            <w:tcW w:w="4719" w:type="dxa"/>
+          </w:tcPr>
+          <w:p>
+            <w:r>
+              <w:t>UI Draft Mockup</w:t>
+            </w:r>
+          </w:p>
+        </w:tc>
+        <w:tc>
+          <w:tcPr>
+            <w:tcW w:w="1291" w:type="dxa"/>
+          </w:tcPr>
+          <w:p>
+            <w:r>
+              <w:t>TBD</w:t>
+            </w:r>
+          </w:p>
+        </w:tc>
+        <w:tc>
+          <w:tcPr>
+            <w:tcW w:w="1681" w:type="dxa"/>
+          </w:tcPr>
+          <w:p>
+            <w:r>
+              <w:t>Phase 1</w:t>
+            </w:r>
+          </w:p>
+        </w:tc>
+        <w:tc>
+          <w:tcPr>
+            <w:tcW w:w="1489" w:type="dxa"/>
+          </w:tcPr>
+          <w:p/>
+        </w:tc>
+      </w:tr>
+      <w:tr>
+        <w:tc>
+          <w:tcPr>
+            <w:tcW w:w="4719" w:type="dxa"/>
+          </w:tcPr>
+          <w:p>
+            <w:r>
+              <w:t>UML Design</w:t>
+            </w:r>
+          </w:p>
+        </w:tc>
+        <w:tc>
+          <w:tcPr>
+            <w:tcW w:w="1291" w:type="dxa"/>
+          </w:tcPr>
+          <w:p>
+            <w:r>
+              <w:t>TBD</w:t>
+            </w:r>
+          </w:p>
+        </w:tc>
+        <w:tc>
+          <w:tcPr>
+            <w:tcW w:w="1681" w:type="dxa"/>
+          </w:tcPr>
+          <w:p>
+            <w:r>
+              <w:t>Phase 1</w:t>
+            </w:r>
+          </w:p>
+        </w:tc>
+        <w:tc>
+          <w:tcPr>
+            <w:tcW w:w="1489" w:type="dxa"/>
+          </w:tcPr>
+          <w:p/>
+        </w:tc>
+      </w:tr>
+      <w:tr>
+        <w:tc>
+          <w:tcPr>
+            <w:tcW w:w="4719" w:type="dxa"/>
+          </w:tcPr>
+          <w:p>
+            <w:r>
+              <w:t>App Login Structure</w:t>
+            </w:r>
+          </w:p>
+        </w:tc>
+        <w:tc>
+          <w:tcPr>
+            <w:tcW w:w="1291" w:type="dxa"/>
+          </w:tcPr>
+          <w:p>
+            <w:r>
+              <w:t>TBD</w:t>
+            </w:r>
+          </w:p>
+        </w:tc>
+        <w:tc>
+          <w:tcPr>
+            <w:tcW w:w="1681" w:type="dxa"/>
+          </w:tcPr>
+          <w:p>
+            <w:r>
+              <w:t>Phase 1</w:t>
+            </w:r>
+          </w:p>
+        </w:tc>
+        <w:tc>
+          <w:tcPr>
+            <w:tcW w:w="1489" w:type="dxa"/>
+          </w:tcPr>
+          <w:p/>
+        </w:tc>
+      </w:tr>
+      <w:tr>
+        <w:tc>
+          <w:tcPr>
+            <w:tcW w:w="4719" w:type="dxa"/>
+          </w:tcPr>
+          <w:p>
+            <w:r>
+              <w:t>Integration of Weather App</w:t>
+            </w:r>
+          </w:p>
+        </w:tc>
+        <w:tc>
+          <w:tcPr>
+            <w:tcW w:w="1291" w:type="dxa"/>
+          </w:tcPr>
+          <w:p>
+            <w:r>
+              <w:t>TBD</w:t>
+            </w:r>
+          </w:p>
+        </w:tc>
+        <w:tc>
+          <w:tcPr>
+            <w:tcW w:w="1681" w:type="dxa"/>
+          </w:tcPr>
+          <w:p>
+            <w:r>
+              <w:t>Phase 1</w:t>
+            </w:r>
+          </w:p>
+        </w:tc>
+        <w:tc>
+          <w:tcPr>
+            <w:tcW w:w="1489" w:type="dxa"/>
+          </w:tcPr>
+          <w:p/>
+        </w:tc>
+      </w:tr>
+      <w:tr>
+        <w:tc>
+          <w:tcPr>
+            <w:tcW w:w="4719" w:type="dxa"/>
+          </w:tcPr>
+          <w:p>
+            <w:r>
+              <w:t>Plant Suggestion Pop-Up</w:t>
+            </w:r>
+          </w:p>
+        </w:tc>
+        <w:tc>
+          <w:tcPr>
+            <w:tcW w:w="1291" w:type="dxa"/>
+          </w:tcPr>
+          <w:p>
+            <w:r>
+              <w:t>TBD</w:t>
+            </w:r>
+          </w:p>
+        </w:tc>
+        <w:tc>
+          <w:tcPr>
+            <w:tcW w:w="1681" w:type="dxa"/>
+          </w:tcPr>
+          <w:p>
+            <w:r>
+              <w:t>Phase 1</w:t>
+            </w:r>
+          </w:p>
+        </w:tc>
+        <w:tc>
+          <w:tcPr>
+            <w:tcW w:w="1489" w:type="dxa"/>
+          </w:tcPr>
+          <w:p/>
+        </w:tc>
+      </w:tr>
+      <w:tr>
+        <w:tc>
+          <w:tcPr>
+            <w:tcW w:w="4719" w:type="dxa"/>
+          </w:tcPr>
+          <w:p/>
+        </w:tc>
+        <w:tc>
+          <w:tcPr>
+            <w:tcW w:w="1291" w:type="dxa"/>
+          </w:tcPr>
+          <w:p>
+            <w:r>
+              <w:t>TBD</w:t>
+            </w:r>
+          </w:p>
+        </w:tc>
+        <w:tc>
+          <w:tcPr>
+            <w:tcW w:w="1681" w:type="dxa"/>
+          </w:tcPr>
+          <w:p>
+            <w:r>
+              <w:t>Phase 1</w:t>
+            </w:r>
+          </w:p>
+        </w:tc>
+        <w:tc>
+          <w:tcPr>
+            <w:tcW w:w="1489" w:type="dxa"/>
+          </w:tcPr>
+          <w:p/>
+        </w:tc>
+      </w:tr>
+      <w:tr>
+        <w:tc>
+          <w:tcPr>
+            <w:tcW w:w="4719" w:type="dxa"/>
+          </w:tcPr>
+          <w:p/>
+        </w:tc>
+        <w:tc>
+          <w:tcPr>
+            <w:tcW w:w="1291" w:type="dxa"/>
+          </w:tcPr>
+          <w:p>
+            <w:r>
+              <w:t>TBD</w:t>
+            </w:r>
+          </w:p>
+        </w:tc>
+        <w:tc>
+          <w:tcPr>
+            <w:tcW w:w="1681" w:type="dxa"/>
+          </w:tcPr>
+          <w:p>
+            <w:r>
+              <w:t>Phase 1</w:t>
+            </w:r>
+          </w:p>
+        </w:tc>
+        <w:tc>
+          <w:tcPr>
+            <w:tcW w:w="1489" w:type="dxa"/>
+          </w:tcPr>
+          <w:p/>
+        </w:tc>
+      </w:tr>
+      <w:tr>
+        <w:tc>
+          <w:tcPr>
+            <w:tcW w:w="4719" w:type="dxa"/>
+          </w:tcPr>
+          <w:p/>
+        </w:tc>
+        <w:tc>
+          <w:tcPr>
+            <w:tcW w:w="1291" w:type="dxa"/>
+          </w:tcPr>
+          <w:p>
+            <w:r>
+              <w:t>TBD</w:t>
+            </w:r>
+          </w:p>
+        </w:tc>
+        <w:tc>
+          <w:tcPr>
+            <w:tcW w:w="1681" w:type="dxa"/>
+          </w:tcPr>
+          <w:p>
+            <w:r>
+              <w:t>Phase 1</w:t>
+            </w:r>
+          </w:p>
+        </w:tc>
+        <w:tc>
+          <w:tcPr>
+            <w:tcW w:w="1489" w:type="dxa"/>
+          </w:tcPr>
+          <w:p/>
+        </w:tc>
+      </w:tr>
+      <w:tr>
+        <w:tc>
+          <w:tcPr>
+            <w:tcW w:w="4719" w:type="dxa"/>
+          </w:tcPr>
+          <w:p/>
+        </w:tc>
+        <w:tc>
+          <w:tcPr>
+            <w:tcW w:w="1291" w:type="dxa"/>
+          </w:tcPr>
+          <w:p>
+            <w:r>
+              <w:t>TBD</w:t>
+            </w:r>
+          </w:p>
+        </w:tc>
+        <w:tc>
+          <w:tcPr>
+            <w:tcW w:w="1681" w:type="dxa"/>
+          </w:tcPr>
+          <w:p>
+            <w:r>
+              <w:t>Phase 1</w:t>
+            </w:r>
+          </w:p>
+        </w:tc>
+        <w:tc>
+          <w:tcPr>
+            <w:tcW w:w="1489" w:type="dxa"/>
+          </w:tcPr>
+          <w:p/>
+        </w:tc>
+      </w:tr>
+    </w:tbl>
+    <w:p/>
+    <w:p/>
     <w:sectPr>
       <w:pgSz w:w="12240" w:h="15840"/>
       <w:pgMar w:top="1440" w:right="1440" w:bottom="1440" w:left="1440" w:header="720" w:footer="720" w:gutter="0"/>
@@ -1357,6 +1907,25 @@
       <w:spacing w:val="5"/>
     </w:rPr>
   </w:style>
+  <w:style w:type="table" w:styleId="TableGrid">
+    <w:name w:val="Table Grid"/>
+    <w:basedOn w:val="TableNormal"/>
+    <w:uiPriority w:val="39"/>
+    <w:rsid w:val="0024247F"/>
+    <w:pPr>
+      <w:spacing w:after="0" w:line="240" w:lineRule="auto"/>
+    </w:pPr>
+    <w:tblPr>
+      <w:tblBorders>
+        <w:top w:val="single" w:sz="4" w:space="0" w:color="auto"/>
+        <w:left w:val="single" w:sz="4" w:space="0" w:color="auto"/>
+        <w:bottom w:val="single" w:sz="4" w:space="0" w:color="auto"/>
+        <w:right w:val="single" w:sz="4" w:space="0" w:color="auto"/>
+        <w:insideH w:val="single" w:sz="4" w:space="0" w:color="auto"/>
+        <w:insideV w:val="single" w:sz="4" w:space="0" w:color="auto"/>
+      </w:tblBorders>
+    </w:tblPr>
+  </w:style>
 </w:styles>
 </file>
 
@@ -1673,4 +2242,10 @@
     </a:ext>
   </a:extLst>
 </a:theme>
+</file>
+
+<file path=docMetadata/LabelInfo.xml><?xml version="1.0" encoding="utf-8"?>
+<clbl:labelList xmlns:clbl="http://schemas.microsoft.com/office/2020/mipLabelMetadata">
+  <clbl:label id="{37f4b8a2-ad4f-41b5-9a91-284d2cc38f56}" enabled="1" method="Standard" siteId="{70de1992-07c6-480f-a318-a1afcba03983}" removed="0"/>
+</clbl:labelList>
 </file>
</xml_diff>

<commit_message>
Updated Project Plan and Readme
Updated project plan and Readme.  Going to work on a web app rather than mobile app.
</commit_message>
<xml_diff>
--- a/Project Plan - Team4.docx
+++ b/Project Plan - Team4.docx
@@ -114,23 +114,7 @@
     </w:p>
     <w:p>
       <w:r>
-        <w:t xml:space="preserve">Our team meets twice weekly in person during 3444.002 (Mondays and Wednesdays).  Additionally, the team is connected via Discord and can meet </w:t>
-      </w:r>
-      <w:proofErr w:type="gramStart"/>
-      <w:r>
-        <w:t>virtually for</w:t>
-      </w:r>
-      <w:proofErr w:type="gramEnd"/>
-      <w:r>
-        <w:t xml:space="preserve"> any additional requirements.  The project files are </w:t>
-      </w:r>
-      <w:proofErr w:type="gramStart"/>
-      <w:r>
-        <w:t>centrally-located</w:t>
-      </w:r>
-      <w:proofErr w:type="gramEnd"/>
-      <w:r>
-        <w:t xml:space="preserve"> on GitHub.</w:t>
+        <w:t>Our team meets twice weekly in person during 3444.002 (Mondays and Wednesdays).  Additionally, the team is connected via Discord and can meet virtually for any additional requirements.  The project files are centrally-located on GitHub.</w:t>
       </w:r>
     </w:p>
     <w:p>
@@ -154,20 +138,11 @@
           <w:b/>
           <w:bCs/>
         </w:rPr>
-        <w:t>Operating System</w:t>
-      </w:r>
-      <w:proofErr w:type="gramStart"/>
-      <w:r>
-        <w:rPr>
-          <w:b/>
-          <w:bCs/>
-        </w:rPr>
-        <w:t xml:space="preserve">:  </w:t>
-      </w:r>
-      <w:r>
-        <w:t>Windows</w:t>
-      </w:r>
-      <w:proofErr w:type="gramEnd"/>
+        <w:t xml:space="preserve">Platform: </w:t>
+      </w:r>
+      <w:r>
+        <w:t>Web application</w:t>
+      </w:r>
     </w:p>
     <w:p>
       <w:pPr>
@@ -185,7 +160,10 @@
         <w:t xml:space="preserve">Programming Language: </w:t>
       </w:r>
       <w:r>
-        <w:t>Python 3.4.3</w:t>
+        <w:t>Python 3.</w:t>
+      </w:r>
+      <w:r>
+        <w:t>12</w:t>
       </w:r>
     </w:p>
     <w:p>
@@ -203,6 +181,16 @@
         </w:rPr>
         <w:t>Framework:</w:t>
       </w:r>
+      <w:r>
+        <w:rPr>
+          <w:b/>
+          <w:bCs/>
+        </w:rPr>
+        <w:t xml:space="preserve">  </w:t>
+      </w:r>
+      <w:r>
+        <w:t>Flask</w:t>
+      </w:r>
     </w:p>
     <w:p>
       <w:pPr>
@@ -217,22 +205,10 @@
           <w:b/>
           <w:bCs/>
         </w:rPr>
-        <w:t>Sharing Tool</w:t>
-      </w:r>
-      <w:proofErr w:type="gramStart"/>
-      <w:r>
-        <w:rPr>
-          <w:b/>
-          <w:bCs/>
-        </w:rPr>
-        <w:t xml:space="preserve">:  </w:t>
-      </w:r>
-      <w:r>
-        <w:t>GitHub</w:t>
-      </w:r>
-      <w:proofErr w:type="gramEnd"/>
-      <w:r>
-        <w:t>, Discord</w:t>
+        <w:t xml:space="preserve">Sharing Tool:  </w:t>
+      </w:r>
+      <w:r>
+        <w:t>GitHub, Discord</w:t>
       </w:r>
     </w:p>
     <w:p>
@@ -248,22 +224,11 @@
           <w:b/>
           <w:bCs/>
         </w:rPr>
-        <w:t>Modelling Tool</w:t>
-      </w:r>
-      <w:proofErr w:type="gramStart"/>
-      <w:r>
-        <w:rPr>
-          <w:b/>
-          <w:bCs/>
-        </w:rPr>
-        <w:t xml:space="preserve">:  </w:t>
-      </w:r>
-      <w:proofErr w:type="spellStart"/>
+        <w:t xml:space="preserve">Modelling Tool:  </w:t>
+      </w:r>
       <w:r>
         <w:t>Lucidchart</w:t>
       </w:r>
-      <w:proofErr w:type="spellEnd"/>
-      <w:proofErr w:type="gramEnd"/>
     </w:p>
     <w:p>
       <w:pPr>
@@ -278,10 +243,10 @@
           <w:b/>
           <w:bCs/>
         </w:rPr>
-        <w:t xml:space="preserve">IDE, text editor: </w:t>
-      </w:r>
-      <w:r>
-        <w:t>VS Code, Word</w:t>
+        <w:t xml:space="preserve">IDE: </w:t>
+      </w:r>
+      <w:r>
+        <w:t>VS Code</w:t>
       </w:r>
     </w:p>
     <w:p>
@@ -297,20 +262,11 @@
           <w:b/>
           <w:bCs/>
         </w:rPr>
-        <w:t>Database</w:t>
-      </w:r>
-      <w:proofErr w:type="gramStart"/>
-      <w:r>
-        <w:rPr>
-          <w:b/>
-          <w:bCs/>
-        </w:rPr>
-        <w:t xml:space="preserve">:  </w:t>
+        <w:t xml:space="preserve">Database:  </w:t>
       </w:r>
       <w:r>
         <w:t>SQLite</w:t>
       </w:r>
-      <w:proofErr w:type="gramEnd"/>
     </w:p>
     <w:p>
       <w:pPr>
@@ -327,7 +283,6 @@
         </w:rPr>
         <w:t>Version Control</w:t>
       </w:r>
-      <w:proofErr w:type="gramStart"/>
       <w:r>
         <w:rPr>
           <w:b/>
@@ -345,7 +300,6 @@
       <w:r>
         <w:t>GitHub</w:t>
       </w:r>
-      <w:proofErr w:type="gramEnd"/>
       <w:r>
         <w:rPr>
           <w:b/>
@@ -375,119 +329,103 @@
         <w:t>Milestone Schedule</w:t>
       </w:r>
     </w:p>
+    <w:p>
+      <w:r>
+        <w:rPr>
+          <w:b/>
+        </w:rPr>
+        <w:t>Phase 1: Foundation &amp; MVP</w:t>
+      </w:r>
+    </w:p>
     <w:tbl>
       <w:tblPr>
         <w:tblStyle w:val="TableGrid"/>
-        <w:tblW w:w="9180" w:type="dxa"/>
-        <w:tblInd w:w="-95" w:type="dxa"/>
+        <w:tblW w:w="9805" w:type="dxa"/>
         <w:tblLook w:val="04A0" w:firstRow="1" w:lastRow="0" w:firstColumn="1" w:lastColumn="0" w:noHBand="0" w:noVBand="1"/>
       </w:tblPr>
       <w:tblGrid>
-        <w:gridCol w:w="4642"/>
-        <w:gridCol w:w="1278"/>
-        <w:gridCol w:w="1681"/>
-        <w:gridCol w:w="1579"/>
+        <w:gridCol w:w="5811"/>
+        <w:gridCol w:w="1114"/>
+        <w:gridCol w:w="1352"/>
+        <w:gridCol w:w="1528"/>
       </w:tblGrid>
       <w:tr>
         <w:tc>
           <w:tcPr>
-            <w:tcW w:w="4719" w:type="dxa"/>
-            <w:shd w:val="clear" w:color="auto" w:fill="4EA72E" w:themeFill="accent6"/>
-          </w:tcPr>
-          <w:p>
-            <w:pPr>
-              <w:rPr>
-                <w:b/>
-                <w:bCs/>
-                <w:color w:val="FFFFFF" w:themeColor="background1"/>
-              </w:rPr>
-            </w:pPr>
-            <w:r>
-              <w:rPr>
-                <w:b/>
-                <w:bCs/>
-                <w:color w:val="FFFFFF" w:themeColor="background1"/>
-              </w:rPr>
+            <w:tcW w:w="5811" w:type="dxa"/>
+            <w:tcBorders>
+              <w:top w:val="single" w:sz="4" w:space="0" w:color="auto"/>
+              <w:left w:val="single" w:sz="4" w:space="0" w:color="auto"/>
+              <w:bottom w:val="single" w:sz="4" w:space="0" w:color="auto"/>
+              <w:right w:val="single" w:sz="4" w:space="0" w:color="auto"/>
+            </w:tcBorders>
+            <w:hideMark/>
+          </w:tcPr>
+          <w:p>
+            <w:pPr>
+              <w:spacing w:after="160" w:line="278" w:lineRule="auto"/>
+            </w:pPr>
+            <w:r>
               <w:t>Milestone</w:t>
             </w:r>
           </w:p>
         </w:tc>
         <w:tc>
           <w:tcPr>
-            <w:tcW w:w="1291" w:type="dxa"/>
-            <w:shd w:val="clear" w:color="auto" w:fill="4EA72E" w:themeFill="accent6"/>
-          </w:tcPr>
-          <w:p>
-            <w:pPr>
-              <w:rPr>
-                <w:b/>
-                <w:bCs/>
-                <w:color w:val="FFFFFF" w:themeColor="background1"/>
-              </w:rPr>
-            </w:pPr>
-            <w:r>
-              <w:rPr>
-                <w:b/>
-                <w:bCs/>
-                <w:color w:val="FFFFFF" w:themeColor="background1"/>
-              </w:rPr>
-              <w:t>Due Date</w:t>
-            </w:r>
-          </w:p>
-        </w:tc>
-        <w:tc>
-          <w:tcPr>
-            <w:tcW w:w="1681" w:type="dxa"/>
-            <w:shd w:val="clear" w:color="auto" w:fill="4EA72E" w:themeFill="accent6"/>
-          </w:tcPr>
-          <w:p>
-            <w:pPr>
-              <w:tabs>
-                <w:tab w:val="right" w:pos="2342"/>
-              </w:tabs>
-              <w:rPr>
-                <w:b/>
-                <w:bCs/>
-                <w:color w:val="FFFFFF" w:themeColor="background1"/>
-              </w:rPr>
-            </w:pPr>
-            <w:r>
-              <w:rPr>
-                <w:b/>
-                <w:bCs/>
-                <w:color w:val="FFFFFF" w:themeColor="background1"/>
-              </w:rPr>
+            <w:tcW w:w="1114" w:type="dxa"/>
+            <w:tcBorders>
+              <w:top w:val="single" w:sz="4" w:space="0" w:color="auto"/>
+              <w:left w:val="single" w:sz="4" w:space="0" w:color="auto"/>
+              <w:bottom w:val="single" w:sz="4" w:space="0" w:color="auto"/>
+              <w:right w:val="single" w:sz="4" w:space="0" w:color="auto"/>
+            </w:tcBorders>
+            <w:hideMark/>
+          </w:tcPr>
+          <w:p>
+            <w:pPr>
+              <w:spacing w:after="160" w:line="278" w:lineRule="auto"/>
+            </w:pPr>
+            <w:r>
+              <w:t>Duration (days)</w:t>
+            </w:r>
+          </w:p>
+        </w:tc>
+        <w:tc>
+          <w:tcPr>
+            <w:tcW w:w="1352" w:type="dxa"/>
+            <w:tcBorders>
+              <w:top w:val="single" w:sz="4" w:space="0" w:color="auto"/>
+              <w:left w:val="single" w:sz="4" w:space="0" w:color="auto"/>
+              <w:bottom w:val="single" w:sz="4" w:space="0" w:color="auto"/>
+              <w:right w:val="single" w:sz="4" w:space="0" w:color="auto"/>
+            </w:tcBorders>
+            <w:hideMark/>
+          </w:tcPr>
+          <w:p>
+            <w:pPr>
+              <w:spacing w:after="160" w:line="278" w:lineRule="auto"/>
+            </w:pPr>
+            <w:r>
               <w:t>Release</w:t>
             </w:r>
-            <w:r>
-              <w:rPr>
-                <w:b/>
-                <w:bCs/>
-                <w:color w:val="FFFFFF" w:themeColor="background1"/>
-              </w:rPr>
-              <w:tab/>
-            </w:r>
-          </w:p>
-        </w:tc>
-        <w:tc>
-          <w:tcPr>
-            <w:tcW w:w="1489" w:type="dxa"/>
-            <w:shd w:val="clear" w:color="auto" w:fill="4EA72E" w:themeFill="accent6"/>
-          </w:tcPr>
-          <w:p>
-            <w:pPr>
-              <w:rPr>
-                <w:b/>
-                <w:bCs/>
-                <w:color w:val="FFFFFF" w:themeColor="background1"/>
-              </w:rPr>
-            </w:pPr>
-            <w:r>
-              <w:rPr>
-                <w:b/>
-                <w:bCs/>
-                <w:color w:val="FFFFFF" w:themeColor="background1"/>
-              </w:rPr>
+          </w:p>
+        </w:tc>
+        <w:tc>
+          <w:tcPr>
+            <w:tcW w:w="1528" w:type="dxa"/>
+            <w:tcBorders>
+              <w:top w:val="single" w:sz="4" w:space="0" w:color="auto"/>
+              <w:left w:val="single" w:sz="4" w:space="0" w:color="auto"/>
+              <w:bottom w:val="single" w:sz="4" w:space="0" w:color="auto"/>
+              <w:right w:val="single" w:sz="4" w:space="0" w:color="auto"/>
+            </w:tcBorders>
+            <w:hideMark/>
+          </w:tcPr>
+          <w:p>
+            <w:pPr>
+              <w:spacing w:after="160" w:line="278" w:lineRule="auto"/>
+            </w:pPr>
+            <w:r>
               <w:t>Deliverable?</w:t>
             </w:r>
           </w:p>
@@ -496,29 +434,59 @@
       <w:tr>
         <w:tc>
           <w:tcPr>
-            <w:tcW w:w="4719" w:type="dxa"/>
-          </w:tcPr>
-          <w:p>
-            <w:r>
-              <w:t>Design Document</w:t>
-            </w:r>
-          </w:p>
-        </w:tc>
-        <w:tc>
-          <w:tcPr>
-            <w:tcW w:w="1291" w:type="dxa"/>
-          </w:tcPr>
-          <w:p>
-            <w:r>
-              <w:t>TBD</w:t>
-            </w:r>
-          </w:p>
-        </w:tc>
-        <w:tc>
-          <w:tcPr>
-            <w:tcW w:w="1681" w:type="dxa"/>
-          </w:tcPr>
-          <w:p>
+            <w:tcW w:w="5811" w:type="dxa"/>
+            <w:tcBorders>
+              <w:top w:val="single" w:sz="4" w:space="0" w:color="auto"/>
+              <w:left w:val="single" w:sz="4" w:space="0" w:color="auto"/>
+              <w:bottom w:val="single" w:sz="4" w:space="0" w:color="auto"/>
+              <w:right w:val="single" w:sz="4" w:space="0" w:color="auto"/>
+            </w:tcBorders>
+            <w:hideMark/>
+          </w:tcPr>
+          <w:p>
+            <w:pPr>
+              <w:spacing w:after="160" w:line="278" w:lineRule="auto"/>
+            </w:pPr>
+            <w:r>
+              <w:t>Requirements gathering &amp; finalize feature list</w:t>
+            </w:r>
+          </w:p>
+        </w:tc>
+        <w:tc>
+          <w:tcPr>
+            <w:tcW w:w="1114" w:type="dxa"/>
+            <w:tcBorders>
+              <w:top w:val="single" w:sz="4" w:space="0" w:color="auto"/>
+              <w:left w:val="single" w:sz="4" w:space="0" w:color="auto"/>
+              <w:bottom w:val="single" w:sz="4" w:space="0" w:color="auto"/>
+              <w:right w:val="single" w:sz="4" w:space="0" w:color="auto"/>
+            </w:tcBorders>
+            <w:hideMark/>
+          </w:tcPr>
+          <w:p>
+            <w:pPr>
+              <w:spacing w:after="160" w:line="278" w:lineRule="auto"/>
+            </w:pPr>
+            <w:r>
+              <w:t>3</w:t>
+            </w:r>
+          </w:p>
+        </w:tc>
+        <w:tc>
+          <w:tcPr>
+            <w:tcW w:w="1352" w:type="dxa"/>
+            <w:tcBorders>
+              <w:top w:val="single" w:sz="4" w:space="0" w:color="auto"/>
+              <w:left w:val="single" w:sz="4" w:space="0" w:color="auto"/>
+              <w:bottom w:val="single" w:sz="4" w:space="0" w:color="auto"/>
+              <w:right w:val="single" w:sz="4" w:space="0" w:color="auto"/>
+            </w:tcBorders>
+            <w:hideMark/>
+          </w:tcPr>
+          <w:p>
+            <w:pPr>
+              <w:spacing w:after="160" w:line="278" w:lineRule="auto"/>
+            </w:pPr>
             <w:r>
               <w:t>Phase 1</w:t>
             </w:r>
@@ -526,37 +494,81 @@
         </w:tc>
         <w:tc>
           <w:tcPr>
-            <w:tcW w:w="1489" w:type="dxa"/>
-          </w:tcPr>
-          <w:p/>
+            <w:tcW w:w="1528" w:type="dxa"/>
+            <w:tcBorders>
+              <w:top w:val="single" w:sz="4" w:space="0" w:color="auto"/>
+              <w:left w:val="single" w:sz="4" w:space="0" w:color="auto"/>
+              <w:bottom w:val="single" w:sz="4" w:space="0" w:color="auto"/>
+              <w:right w:val="single" w:sz="4" w:space="0" w:color="auto"/>
+            </w:tcBorders>
+            <w:hideMark/>
+          </w:tcPr>
+          <w:p>
+            <w:pPr>
+              <w:spacing w:after="160" w:line="278" w:lineRule="auto"/>
+            </w:pPr>
+            <w:r>
+              <w:t>No</w:t>
+            </w:r>
+          </w:p>
         </w:tc>
       </w:tr>
       <w:tr>
         <w:tc>
           <w:tcPr>
-            <w:tcW w:w="4719" w:type="dxa"/>
-          </w:tcPr>
-          <w:p>
-            <w:r>
-              <w:t>UI Draft Mockup</w:t>
-            </w:r>
-          </w:p>
-        </w:tc>
-        <w:tc>
-          <w:tcPr>
-            <w:tcW w:w="1291" w:type="dxa"/>
-          </w:tcPr>
-          <w:p>
-            <w:r>
-              <w:t>TBD</w:t>
-            </w:r>
-          </w:p>
-        </w:tc>
-        <w:tc>
-          <w:tcPr>
-            <w:tcW w:w="1681" w:type="dxa"/>
-          </w:tcPr>
-          <w:p>
+            <w:tcW w:w="5811" w:type="dxa"/>
+            <w:tcBorders>
+              <w:top w:val="single" w:sz="4" w:space="0" w:color="auto"/>
+              <w:left w:val="single" w:sz="4" w:space="0" w:color="auto"/>
+              <w:bottom w:val="single" w:sz="4" w:space="0" w:color="auto"/>
+              <w:right w:val="single" w:sz="4" w:space="0" w:color="auto"/>
+            </w:tcBorders>
+            <w:hideMark/>
+          </w:tcPr>
+          <w:p>
+            <w:pPr>
+              <w:spacing w:after="160" w:line="278" w:lineRule="auto"/>
+            </w:pPr>
+            <w:r>
+              <w:t>Database schema design (plants, zones, users)</w:t>
+            </w:r>
+          </w:p>
+        </w:tc>
+        <w:tc>
+          <w:tcPr>
+            <w:tcW w:w="1114" w:type="dxa"/>
+            <w:tcBorders>
+              <w:top w:val="single" w:sz="4" w:space="0" w:color="auto"/>
+              <w:left w:val="single" w:sz="4" w:space="0" w:color="auto"/>
+              <w:bottom w:val="single" w:sz="4" w:space="0" w:color="auto"/>
+              <w:right w:val="single" w:sz="4" w:space="0" w:color="auto"/>
+            </w:tcBorders>
+            <w:hideMark/>
+          </w:tcPr>
+          <w:p>
+            <w:pPr>
+              <w:spacing w:after="160" w:line="278" w:lineRule="auto"/>
+            </w:pPr>
+            <w:r>
+              <w:t>4</w:t>
+            </w:r>
+          </w:p>
+        </w:tc>
+        <w:tc>
+          <w:tcPr>
+            <w:tcW w:w="1352" w:type="dxa"/>
+            <w:tcBorders>
+              <w:top w:val="single" w:sz="4" w:space="0" w:color="auto"/>
+              <w:left w:val="single" w:sz="4" w:space="0" w:color="auto"/>
+              <w:bottom w:val="single" w:sz="4" w:space="0" w:color="auto"/>
+              <w:right w:val="single" w:sz="4" w:space="0" w:color="auto"/>
+            </w:tcBorders>
+            <w:hideMark/>
+          </w:tcPr>
+          <w:p>
+            <w:pPr>
+              <w:spacing w:after="160" w:line="278" w:lineRule="auto"/>
+            </w:pPr>
             <w:r>
               <w:t>Phase 1</w:t>
             </w:r>
@@ -564,37 +576,81 @@
         </w:tc>
         <w:tc>
           <w:tcPr>
-            <w:tcW w:w="1489" w:type="dxa"/>
-          </w:tcPr>
-          <w:p/>
+            <w:tcW w:w="1528" w:type="dxa"/>
+            <w:tcBorders>
+              <w:top w:val="single" w:sz="4" w:space="0" w:color="auto"/>
+              <w:left w:val="single" w:sz="4" w:space="0" w:color="auto"/>
+              <w:bottom w:val="single" w:sz="4" w:space="0" w:color="auto"/>
+              <w:right w:val="single" w:sz="4" w:space="0" w:color="auto"/>
+            </w:tcBorders>
+            <w:hideMark/>
+          </w:tcPr>
+          <w:p>
+            <w:pPr>
+              <w:spacing w:after="160" w:line="278" w:lineRule="auto"/>
+            </w:pPr>
+            <w:r>
+              <w:t>No</w:t>
+            </w:r>
+          </w:p>
         </w:tc>
       </w:tr>
       <w:tr>
         <w:tc>
           <w:tcPr>
-            <w:tcW w:w="4719" w:type="dxa"/>
-          </w:tcPr>
-          <w:p>
-            <w:r>
-              <w:t>UML Design</w:t>
-            </w:r>
-          </w:p>
-        </w:tc>
-        <w:tc>
-          <w:tcPr>
-            <w:tcW w:w="1291" w:type="dxa"/>
-          </w:tcPr>
-          <w:p>
-            <w:r>
-              <w:t>TBD</w:t>
-            </w:r>
-          </w:p>
-        </w:tc>
-        <w:tc>
-          <w:tcPr>
-            <w:tcW w:w="1681" w:type="dxa"/>
-          </w:tcPr>
-          <w:p>
+            <w:tcW w:w="5811" w:type="dxa"/>
+            <w:tcBorders>
+              <w:top w:val="single" w:sz="4" w:space="0" w:color="auto"/>
+              <w:left w:val="single" w:sz="4" w:space="0" w:color="auto"/>
+              <w:bottom w:val="single" w:sz="4" w:space="0" w:color="auto"/>
+              <w:right w:val="single" w:sz="4" w:space="0" w:color="auto"/>
+            </w:tcBorders>
+            <w:hideMark/>
+          </w:tcPr>
+          <w:p>
+            <w:pPr>
+              <w:spacing w:after="160" w:line="278" w:lineRule="auto"/>
+            </w:pPr>
+            <w:r>
+              <w:t>UML / architecture diagram</w:t>
+            </w:r>
+          </w:p>
+        </w:tc>
+        <w:tc>
+          <w:tcPr>
+            <w:tcW w:w="1114" w:type="dxa"/>
+            <w:tcBorders>
+              <w:top w:val="single" w:sz="4" w:space="0" w:color="auto"/>
+              <w:left w:val="single" w:sz="4" w:space="0" w:color="auto"/>
+              <w:bottom w:val="single" w:sz="4" w:space="0" w:color="auto"/>
+              <w:right w:val="single" w:sz="4" w:space="0" w:color="auto"/>
+            </w:tcBorders>
+            <w:hideMark/>
+          </w:tcPr>
+          <w:p>
+            <w:pPr>
+              <w:spacing w:after="160" w:line="278" w:lineRule="auto"/>
+            </w:pPr>
+            <w:r>
+              <w:t>4</w:t>
+            </w:r>
+          </w:p>
+        </w:tc>
+        <w:tc>
+          <w:tcPr>
+            <w:tcW w:w="1352" w:type="dxa"/>
+            <w:tcBorders>
+              <w:top w:val="single" w:sz="4" w:space="0" w:color="auto"/>
+              <w:left w:val="single" w:sz="4" w:space="0" w:color="auto"/>
+              <w:bottom w:val="single" w:sz="4" w:space="0" w:color="auto"/>
+              <w:right w:val="single" w:sz="4" w:space="0" w:color="auto"/>
+            </w:tcBorders>
+            <w:hideMark/>
+          </w:tcPr>
+          <w:p>
+            <w:pPr>
+              <w:spacing w:after="160" w:line="278" w:lineRule="auto"/>
+            </w:pPr>
             <w:r>
               <w:t>Phase 1</w:t>
             </w:r>
@@ -602,37 +658,81 @@
         </w:tc>
         <w:tc>
           <w:tcPr>
-            <w:tcW w:w="1489" w:type="dxa"/>
-          </w:tcPr>
-          <w:p/>
+            <w:tcW w:w="1528" w:type="dxa"/>
+            <w:tcBorders>
+              <w:top w:val="single" w:sz="4" w:space="0" w:color="auto"/>
+              <w:left w:val="single" w:sz="4" w:space="0" w:color="auto"/>
+              <w:bottom w:val="single" w:sz="4" w:space="0" w:color="auto"/>
+              <w:right w:val="single" w:sz="4" w:space="0" w:color="auto"/>
+            </w:tcBorders>
+            <w:hideMark/>
+          </w:tcPr>
+          <w:p>
+            <w:pPr>
+              <w:spacing w:after="160" w:line="278" w:lineRule="auto"/>
+            </w:pPr>
+            <w:r>
+              <w:t>Yes</w:t>
+            </w:r>
+          </w:p>
         </w:tc>
       </w:tr>
       <w:tr>
         <w:tc>
           <w:tcPr>
-            <w:tcW w:w="4719" w:type="dxa"/>
-          </w:tcPr>
-          <w:p>
-            <w:r>
-              <w:t>App Login Structure</w:t>
-            </w:r>
-          </w:p>
-        </w:tc>
-        <w:tc>
-          <w:tcPr>
-            <w:tcW w:w="1291" w:type="dxa"/>
-          </w:tcPr>
-          <w:p>
-            <w:r>
-              <w:t>TBD</w:t>
-            </w:r>
-          </w:p>
-        </w:tc>
-        <w:tc>
-          <w:tcPr>
-            <w:tcW w:w="1681" w:type="dxa"/>
-          </w:tcPr>
-          <w:p>
+            <w:tcW w:w="5811" w:type="dxa"/>
+            <w:tcBorders>
+              <w:top w:val="single" w:sz="4" w:space="0" w:color="auto"/>
+              <w:left w:val="single" w:sz="4" w:space="0" w:color="auto"/>
+              <w:bottom w:val="single" w:sz="4" w:space="0" w:color="auto"/>
+              <w:right w:val="single" w:sz="4" w:space="0" w:color="auto"/>
+            </w:tcBorders>
+            <w:hideMark/>
+          </w:tcPr>
+          <w:p>
+            <w:pPr>
+              <w:spacing w:after="160" w:line="278" w:lineRule="auto"/>
+            </w:pPr>
+            <w:r>
+              <w:t>UI wireframe / mockup</w:t>
+            </w:r>
+          </w:p>
+        </w:tc>
+        <w:tc>
+          <w:tcPr>
+            <w:tcW w:w="1114" w:type="dxa"/>
+            <w:tcBorders>
+              <w:top w:val="single" w:sz="4" w:space="0" w:color="auto"/>
+              <w:left w:val="single" w:sz="4" w:space="0" w:color="auto"/>
+              <w:bottom w:val="single" w:sz="4" w:space="0" w:color="auto"/>
+              <w:right w:val="single" w:sz="4" w:space="0" w:color="auto"/>
+            </w:tcBorders>
+            <w:hideMark/>
+          </w:tcPr>
+          <w:p>
+            <w:pPr>
+              <w:spacing w:after="160" w:line="278" w:lineRule="auto"/>
+            </w:pPr>
+            <w:r>
+              <w:t>5</w:t>
+            </w:r>
+          </w:p>
+        </w:tc>
+        <w:tc>
+          <w:tcPr>
+            <w:tcW w:w="1352" w:type="dxa"/>
+            <w:tcBorders>
+              <w:top w:val="single" w:sz="4" w:space="0" w:color="auto"/>
+              <w:left w:val="single" w:sz="4" w:space="0" w:color="auto"/>
+              <w:bottom w:val="single" w:sz="4" w:space="0" w:color="auto"/>
+              <w:right w:val="single" w:sz="4" w:space="0" w:color="auto"/>
+            </w:tcBorders>
+            <w:hideMark/>
+          </w:tcPr>
+          <w:p>
+            <w:pPr>
+              <w:spacing w:after="160" w:line="278" w:lineRule="auto"/>
+            </w:pPr>
             <w:r>
               <w:t>Phase 1</w:t>
             </w:r>
@@ -640,37 +740,81 @@
         </w:tc>
         <w:tc>
           <w:tcPr>
-            <w:tcW w:w="1489" w:type="dxa"/>
-          </w:tcPr>
-          <w:p/>
+            <w:tcW w:w="1528" w:type="dxa"/>
+            <w:tcBorders>
+              <w:top w:val="single" w:sz="4" w:space="0" w:color="auto"/>
+              <w:left w:val="single" w:sz="4" w:space="0" w:color="auto"/>
+              <w:bottom w:val="single" w:sz="4" w:space="0" w:color="auto"/>
+              <w:right w:val="single" w:sz="4" w:space="0" w:color="auto"/>
+            </w:tcBorders>
+            <w:hideMark/>
+          </w:tcPr>
+          <w:p>
+            <w:pPr>
+              <w:spacing w:after="160" w:line="278" w:lineRule="auto"/>
+            </w:pPr>
+            <w:r>
+              <w:t>Yes</w:t>
+            </w:r>
+          </w:p>
         </w:tc>
       </w:tr>
       <w:tr>
         <w:tc>
           <w:tcPr>
-            <w:tcW w:w="4719" w:type="dxa"/>
-          </w:tcPr>
-          <w:p>
-            <w:r>
-              <w:t>Integration of Weather App</w:t>
-            </w:r>
-          </w:p>
-        </w:tc>
-        <w:tc>
-          <w:tcPr>
-            <w:tcW w:w="1291" w:type="dxa"/>
-          </w:tcPr>
-          <w:p>
-            <w:r>
-              <w:t>TBD</w:t>
-            </w:r>
-          </w:p>
-        </w:tc>
-        <w:tc>
-          <w:tcPr>
-            <w:tcW w:w="1681" w:type="dxa"/>
-          </w:tcPr>
-          <w:p>
+            <w:tcW w:w="5811" w:type="dxa"/>
+            <w:tcBorders>
+              <w:top w:val="single" w:sz="4" w:space="0" w:color="auto"/>
+              <w:left w:val="single" w:sz="4" w:space="0" w:color="auto"/>
+              <w:bottom w:val="single" w:sz="4" w:space="0" w:color="auto"/>
+              <w:right w:val="single" w:sz="4" w:space="0" w:color="auto"/>
+            </w:tcBorders>
+            <w:hideMark/>
+          </w:tcPr>
+          <w:p>
+            <w:pPr>
+              <w:spacing w:after="160" w:line="278" w:lineRule="auto"/>
+            </w:pPr>
+            <w:r>
+              <w:t>Set up Flask project structure &amp; GitHub workflow</w:t>
+            </w:r>
+          </w:p>
+        </w:tc>
+        <w:tc>
+          <w:tcPr>
+            <w:tcW w:w="1114" w:type="dxa"/>
+            <w:tcBorders>
+              <w:top w:val="single" w:sz="4" w:space="0" w:color="auto"/>
+              <w:left w:val="single" w:sz="4" w:space="0" w:color="auto"/>
+              <w:bottom w:val="single" w:sz="4" w:space="0" w:color="auto"/>
+              <w:right w:val="single" w:sz="4" w:space="0" w:color="auto"/>
+            </w:tcBorders>
+            <w:hideMark/>
+          </w:tcPr>
+          <w:p>
+            <w:pPr>
+              <w:spacing w:after="160" w:line="278" w:lineRule="auto"/>
+            </w:pPr>
+            <w:r>
+              <w:t>3</w:t>
+            </w:r>
+          </w:p>
+        </w:tc>
+        <w:tc>
+          <w:tcPr>
+            <w:tcW w:w="1352" w:type="dxa"/>
+            <w:tcBorders>
+              <w:top w:val="single" w:sz="4" w:space="0" w:color="auto"/>
+              <w:left w:val="single" w:sz="4" w:space="0" w:color="auto"/>
+              <w:bottom w:val="single" w:sz="4" w:space="0" w:color="auto"/>
+              <w:right w:val="single" w:sz="4" w:space="0" w:color="auto"/>
+            </w:tcBorders>
+            <w:hideMark/>
+          </w:tcPr>
+          <w:p>
+            <w:pPr>
+              <w:spacing w:after="160" w:line="278" w:lineRule="auto"/>
+            </w:pPr>
             <w:r>
               <w:t>Phase 1</w:t>
             </w:r>
@@ -678,37 +822,81 @@
         </w:tc>
         <w:tc>
           <w:tcPr>
-            <w:tcW w:w="1489" w:type="dxa"/>
-          </w:tcPr>
-          <w:p/>
+            <w:tcW w:w="1528" w:type="dxa"/>
+            <w:tcBorders>
+              <w:top w:val="single" w:sz="4" w:space="0" w:color="auto"/>
+              <w:left w:val="single" w:sz="4" w:space="0" w:color="auto"/>
+              <w:bottom w:val="single" w:sz="4" w:space="0" w:color="auto"/>
+              <w:right w:val="single" w:sz="4" w:space="0" w:color="auto"/>
+            </w:tcBorders>
+            <w:hideMark/>
+          </w:tcPr>
+          <w:p>
+            <w:pPr>
+              <w:spacing w:after="160" w:line="278" w:lineRule="auto"/>
+            </w:pPr>
+            <w:r>
+              <w:t>No</w:t>
+            </w:r>
+          </w:p>
         </w:tc>
       </w:tr>
       <w:tr>
         <w:tc>
           <w:tcPr>
-            <w:tcW w:w="4719" w:type="dxa"/>
-          </w:tcPr>
-          <w:p>
-            <w:r>
-              <w:t>Plant Suggestion Pop-Up</w:t>
-            </w:r>
-          </w:p>
-        </w:tc>
-        <w:tc>
-          <w:tcPr>
-            <w:tcW w:w="1291" w:type="dxa"/>
-          </w:tcPr>
-          <w:p>
-            <w:r>
-              <w:t>TBD</w:t>
-            </w:r>
-          </w:p>
-        </w:tc>
-        <w:tc>
-          <w:tcPr>
-            <w:tcW w:w="1681" w:type="dxa"/>
-          </w:tcPr>
-          <w:p>
+            <w:tcW w:w="5811" w:type="dxa"/>
+            <w:tcBorders>
+              <w:top w:val="single" w:sz="4" w:space="0" w:color="auto"/>
+              <w:left w:val="single" w:sz="4" w:space="0" w:color="auto"/>
+              <w:bottom w:val="single" w:sz="4" w:space="0" w:color="auto"/>
+              <w:right w:val="single" w:sz="4" w:space="0" w:color="auto"/>
+            </w:tcBorders>
+            <w:hideMark/>
+          </w:tcPr>
+          <w:p>
+            <w:pPr>
+              <w:spacing w:after="160" w:line="278" w:lineRule="auto"/>
+            </w:pPr>
+            <w:r>
+              <w:t>Zip code → growing zone lookup (USDA API integration)</w:t>
+            </w:r>
+          </w:p>
+        </w:tc>
+        <w:tc>
+          <w:tcPr>
+            <w:tcW w:w="1114" w:type="dxa"/>
+            <w:tcBorders>
+              <w:top w:val="single" w:sz="4" w:space="0" w:color="auto"/>
+              <w:left w:val="single" w:sz="4" w:space="0" w:color="auto"/>
+              <w:bottom w:val="single" w:sz="4" w:space="0" w:color="auto"/>
+              <w:right w:val="single" w:sz="4" w:space="0" w:color="auto"/>
+            </w:tcBorders>
+            <w:hideMark/>
+          </w:tcPr>
+          <w:p>
+            <w:pPr>
+              <w:spacing w:after="160" w:line="278" w:lineRule="auto"/>
+            </w:pPr>
+            <w:r>
+              <w:t>6</w:t>
+            </w:r>
+          </w:p>
+        </w:tc>
+        <w:tc>
+          <w:tcPr>
+            <w:tcW w:w="1352" w:type="dxa"/>
+            <w:tcBorders>
+              <w:top w:val="single" w:sz="4" w:space="0" w:color="auto"/>
+              <w:left w:val="single" w:sz="4" w:space="0" w:color="auto"/>
+              <w:bottom w:val="single" w:sz="4" w:space="0" w:color="auto"/>
+              <w:right w:val="single" w:sz="4" w:space="0" w:color="auto"/>
+            </w:tcBorders>
+            <w:hideMark/>
+          </w:tcPr>
+          <w:p>
+            <w:pPr>
+              <w:spacing w:after="160" w:line="278" w:lineRule="auto"/>
+            </w:pPr>
             <w:r>
               <w:t>Phase 1</w:t>
             </w:r>
@@ -716,33 +904,81 @@
         </w:tc>
         <w:tc>
           <w:tcPr>
-            <w:tcW w:w="1489" w:type="dxa"/>
-          </w:tcPr>
-          <w:p/>
+            <w:tcW w:w="1528" w:type="dxa"/>
+            <w:tcBorders>
+              <w:top w:val="single" w:sz="4" w:space="0" w:color="auto"/>
+              <w:left w:val="single" w:sz="4" w:space="0" w:color="auto"/>
+              <w:bottom w:val="single" w:sz="4" w:space="0" w:color="auto"/>
+              <w:right w:val="single" w:sz="4" w:space="0" w:color="auto"/>
+            </w:tcBorders>
+            <w:hideMark/>
+          </w:tcPr>
+          <w:p>
+            <w:pPr>
+              <w:spacing w:after="160" w:line="278" w:lineRule="auto"/>
+            </w:pPr>
+            <w:r>
+              <w:t>No</w:t>
+            </w:r>
+          </w:p>
         </w:tc>
       </w:tr>
       <w:tr>
         <w:tc>
           <w:tcPr>
-            <w:tcW w:w="4719" w:type="dxa"/>
-          </w:tcPr>
-          <w:p/>
-        </w:tc>
-        <w:tc>
-          <w:tcPr>
-            <w:tcW w:w="1291" w:type="dxa"/>
-          </w:tcPr>
-          <w:p>
-            <w:r>
-              <w:t>TBD</w:t>
-            </w:r>
-          </w:p>
-        </w:tc>
-        <w:tc>
-          <w:tcPr>
-            <w:tcW w:w="1681" w:type="dxa"/>
-          </w:tcPr>
-          <w:p>
+            <w:tcW w:w="5811" w:type="dxa"/>
+            <w:tcBorders>
+              <w:top w:val="single" w:sz="4" w:space="0" w:color="auto"/>
+              <w:left w:val="single" w:sz="4" w:space="0" w:color="auto"/>
+              <w:bottom w:val="single" w:sz="4" w:space="0" w:color="auto"/>
+              <w:right w:val="single" w:sz="4" w:space="0" w:color="auto"/>
+            </w:tcBorders>
+            <w:hideMark/>
+          </w:tcPr>
+          <w:p>
+            <w:pPr>
+              <w:spacing w:after="160" w:line="278" w:lineRule="auto"/>
+            </w:pPr>
+            <w:r>
+              <w:t>Plant suggestion list (filter by zone + season)</w:t>
+            </w:r>
+          </w:p>
+        </w:tc>
+        <w:tc>
+          <w:tcPr>
+            <w:tcW w:w="1114" w:type="dxa"/>
+            <w:tcBorders>
+              <w:top w:val="single" w:sz="4" w:space="0" w:color="auto"/>
+              <w:left w:val="single" w:sz="4" w:space="0" w:color="auto"/>
+              <w:bottom w:val="single" w:sz="4" w:space="0" w:color="auto"/>
+              <w:right w:val="single" w:sz="4" w:space="0" w:color="auto"/>
+            </w:tcBorders>
+            <w:hideMark/>
+          </w:tcPr>
+          <w:p>
+            <w:pPr>
+              <w:spacing w:after="160" w:line="278" w:lineRule="auto"/>
+            </w:pPr>
+            <w:r>
+              <w:t>7</w:t>
+            </w:r>
+          </w:p>
+        </w:tc>
+        <w:tc>
+          <w:tcPr>
+            <w:tcW w:w="1352" w:type="dxa"/>
+            <w:tcBorders>
+              <w:top w:val="single" w:sz="4" w:space="0" w:color="auto"/>
+              <w:left w:val="single" w:sz="4" w:space="0" w:color="auto"/>
+              <w:bottom w:val="single" w:sz="4" w:space="0" w:color="auto"/>
+              <w:right w:val="single" w:sz="4" w:space="0" w:color="auto"/>
+            </w:tcBorders>
+            <w:hideMark/>
+          </w:tcPr>
+          <w:p>
+            <w:pPr>
+              <w:spacing w:after="160" w:line="278" w:lineRule="auto"/>
+            </w:pPr>
             <w:r>
               <w:t>Phase 1</w:t>
             </w:r>
@@ -750,33 +986,81 @@
         </w:tc>
         <w:tc>
           <w:tcPr>
-            <w:tcW w:w="1489" w:type="dxa"/>
-          </w:tcPr>
-          <w:p/>
+            <w:tcW w:w="1528" w:type="dxa"/>
+            <w:tcBorders>
+              <w:top w:val="single" w:sz="4" w:space="0" w:color="auto"/>
+              <w:left w:val="single" w:sz="4" w:space="0" w:color="auto"/>
+              <w:bottom w:val="single" w:sz="4" w:space="0" w:color="auto"/>
+              <w:right w:val="single" w:sz="4" w:space="0" w:color="auto"/>
+            </w:tcBorders>
+            <w:hideMark/>
+          </w:tcPr>
+          <w:p>
+            <w:pPr>
+              <w:spacing w:after="160" w:line="278" w:lineRule="auto"/>
+            </w:pPr>
+            <w:r>
+              <w:t>No</w:t>
+            </w:r>
+          </w:p>
         </w:tc>
       </w:tr>
       <w:tr>
         <w:tc>
           <w:tcPr>
-            <w:tcW w:w="4719" w:type="dxa"/>
-          </w:tcPr>
-          <w:p/>
-        </w:tc>
-        <w:tc>
-          <w:tcPr>
-            <w:tcW w:w="1291" w:type="dxa"/>
-          </w:tcPr>
-          <w:p>
-            <w:r>
-              <w:t>TBD</w:t>
-            </w:r>
-          </w:p>
-        </w:tc>
-        <w:tc>
-          <w:tcPr>
-            <w:tcW w:w="1681" w:type="dxa"/>
-          </w:tcPr>
-          <w:p>
+            <w:tcW w:w="5811" w:type="dxa"/>
+            <w:tcBorders>
+              <w:top w:val="single" w:sz="4" w:space="0" w:color="auto"/>
+              <w:left w:val="single" w:sz="4" w:space="0" w:color="auto"/>
+              <w:bottom w:val="single" w:sz="4" w:space="0" w:color="auto"/>
+              <w:right w:val="single" w:sz="4" w:space="0" w:color="auto"/>
+            </w:tcBorders>
+            <w:hideMark/>
+          </w:tcPr>
+          <w:p>
+            <w:pPr>
+              <w:spacing w:after="160" w:line="278" w:lineRule="auto"/>
+            </w:pPr>
+            <w:r>
+              <w:t>Basic frontend pages (home, results, search)</w:t>
+            </w:r>
+          </w:p>
+        </w:tc>
+        <w:tc>
+          <w:tcPr>
+            <w:tcW w:w="1114" w:type="dxa"/>
+            <w:tcBorders>
+              <w:top w:val="single" w:sz="4" w:space="0" w:color="auto"/>
+              <w:left w:val="single" w:sz="4" w:space="0" w:color="auto"/>
+              <w:bottom w:val="single" w:sz="4" w:space="0" w:color="auto"/>
+              <w:right w:val="single" w:sz="4" w:space="0" w:color="auto"/>
+            </w:tcBorders>
+            <w:hideMark/>
+          </w:tcPr>
+          <w:p>
+            <w:pPr>
+              <w:spacing w:after="160" w:line="278" w:lineRule="auto"/>
+            </w:pPr>
+            <w:r>
+              <w:t>6</w:t>
+            </w:r>
+          </w:p>
+        </w:tc>
+        <w:tc>
+          <w:tcPr>
+            <w:tcW w:w="1352" w:type="dxa"/>
+            <w:tcBorders>
+              <w:top w:val="single" w:sz="4" w:space="0" w:color="auto"/>
+              <w:left w:val="single" w:sz="4" w:space="0" w:color="auto"/>
+              <w:bottom w:val="single" w:sz="4" w:space="0" w:color="auto"/>
+              <w:right w:val="single" w:sz="4" w:space="0" w:color="auto"/>
+            </w:tcBorders>
+            <w:hideMark/>
+          </w:tcPr>
+          <w:p>
+            <w:pPr>
+              <w:spacing w:after="160" w:line="278" w:lineRule="auto"/>
+            </w:pPr>
             <w:r>
               <w:t>Phase 1</w:t>
             </w:r>
@@ -784,33 +1068,81 @@
         </w:tc>
         <w:tc>
           <w:tcPr>
-            <w:tcW w:w="1489" w:type="dxa"/>
-          </w:tcPr>
-          <w:p/>
+            <w:tcW w:w="1528" w:type="dxa"/>
+            <w:tcBorders>
+              <w:top w:val="single" w:sz="4" w:space="0" w:color="auto"/>
+              <w:left w:val="single" w:sz="4" w:space="0" w:color="auto"/>
+              <w:bottom w:val="single" w:sz="4" w:space="0" w:color="auto"/>
+              <w:right w:val="single" w:sz="4" w:space="0" w:color="auto"/>
+            </w:tcBorders>
+            <w:hideMark/>
+          </w:tcPr>
+          <w:p>
+            <w:pPr>
+              <w:spacing w:after="160" w:line="278" w:lineRule="auto"/>
+            </w:pPr>
+            <w:r>
+              <w:t>No</w:t>
+            </w:r>
+          </w:p>
         </w:tc>
       </w:tr>
       <w:tr>
         <w:tc>
           <w:tcPr>
-            <w:tcW w:w="4719" w:type="dxa"/>
-          </w:tcPr>
-          <w:p/>
-        </w:tc>
-        <w:tc>
-          <w:tcPr>
-            <w:tcW w:w="1291" w:type="dxa"/>
-          </w:tcPr>
-          <w:p>
-            <w:r>
-              <w:t>TBD</w:t>
-            </w:r>
-          </w:p>
-        </w:tc>
-        <w:tc>
-          <w:tcPr>
-            <w:tcW w:w="1681" w:type="dxa"/>
-          </w:tcPr>
-          <w:p>
+            <w:tcW w:w="5811" w:type="dxa"/>
+            <w:tcBorders>
+              <w:top w:val="single" w:sz="4" w:space="0" w:color="auto"/>
+              <w:left w:val="single" w:sz="4" w:space="0" w:color="auto"/>
+              <w:bottom w:val="single" w:sz="4" w:space="0" w:color="auto"/>
+              <w:right w:val="single" w:sz="4" w:space="0" w:color="auto"/>
+            </w:tcBorders>
+            <w:hideMark/>
+          </w:tcPr>
+          <w:p>
+            <w:pPr>
+              <w:spacing w:after="160" w:line="278" w:lineRule="auto"/>
+            </w:pPr>
+            <w:r>
+              <w:t>Weather API integration (NOAA)</w:t>
+            </w:r>
+          </w:p>
+        </w:tc>
+        <w:tc>
+          <w:tcPr>
+            <w:tcW w:w="1114" w:type="dxa"/>
+            <w:tcBorders>
+              <w:top w:val="single" w:sz="4" w:space="0" w:color="auto"/>
+              <w:left w:val="single" w:sz="4" w:space="0" w:color="auto"/>
+              <w:bottom w:val="single" w:sz="4" w:space="0" w:color="auto"/>
+              <w:right w:val="single" w:sz="4" w:space="0" w:color="auto"/>
+            </w:tcBorders>
+            <w:hideMark/>
+          </w:tcPr>
+          <w:p>
+            <w:pPr>
+              <w:spacing w:after="160" w:line="278" w:lineRule="auto"/>
+            </w:pPr>
+            <w:r>
+              <w:t>5</w:t>
+            </w:r>
+          </w:p>
+        </w:tc>
+        <w:tc>
+          <w:tcPr>
+            <w:tcW w:w="1352" w:type="dxa"/>
+            <w:tcBorders>
+              <w:top w:val="single" w:sz="4" w:space="0" w:color="auto"/>
+              <w:left w:val="single" w:sz="4" w:space="0" w:color="auto"/>
+              <w:bottom w:val="single" w:sz="4" w:space="0" w:color="auto"/>
+              <w:right w:val="single" w:sz="4" w:space="0" w:color="auto"/>
+            </w:tcBorders>
+            <w:hideMark/>
+          </w:tcPr>
+          <w:p>
+            <w:pPr>
+              <w:spacing w:after="160" w:line="278" w:lineRule="auto"/>
+            </w:pPr>
             <w:r>
               <w:t>Phase 1</w:t>
             </w:r>
@@ -818,33 +1150,81 @@
         </w:tc>
         <w:tc>
           <w:tcPr>
-            <w:tcW w:w="1489" w:type="dxa"/>
-          </w:tcPr>
-          <w:p/>
+            <w:tcW w:w="1528" w:type="dxa"/>
+            <w:tcBorders>
+              <w:top w:val="single" w:sz="4" w:space="0" w:color="auto"/>
+              <w:left w:val="single" w:sz="4" w:space="0" w:color="auto"/>
+              <w:bottom w:val="single" w:sz="4" w:space="0" w:color="auto"/>
+              <w:right w:val="single" w:sz="4" w:space="0" w:color="auto"/>
+            </w:tcBorders>
+            <w:hideMark/>
+          </w:tcPr>
+          <w:p>
+            <w:pPr>
+              <w:spacing w:after="160" w:line="278" w:lineRule="auto"/>
+            </w:pPr>
+            <w:r>
+              <w:t>No</w:t>
+            </w:r>
+          </w:p>
         </w:tc>
       </w:tr>
       <w:tr>
         <w:tc>
           <w:tcPr>
-            <w:tcW w:w="4719" w:type="dxa"/>
-          </w:tcPr>
-          <w:p/>
-        </w:tc>
-        <w:tc>
-          <w:tcPr>
-            <w:tcW w:w="1291" w:type="dxa"/>
-          </w:tcPr>
-          <w:p>
-            <w:r>
-              <w:t>TBD</w:t>
-            </w:r>
-          </w:p>
-        </w:tc>
-        <w:tc>
-          <w:tcPr>
-            <w:tcW w:w="1681" w:type="dxa"/>
-          </w:tcPr>
-          <w:p>
+            <w:tcW w:w="5811" w:type="dxa"/>
+            <w:tcBorders>
+              <w:top w:val="single" w:sz="4" w:space="0" w:color="auto"/>
+              <w:left w:val="single" w:sz="4" w:space="0" w:color="auto"/>
+              <w:bottom w:val="single" w:sz="4" w:space="0" w:color="auto"/>
+              <w:right w:val="single" w:sz="4" w:space="0" w:color="auto"/>
+            </w:tcBorders>
+            <w:hideMark/>
+          </w:tcPr>
+          <w:p>
+            <w:pPr>
+              <w:spacing w:after="160" w:line="278" w:lineRule="auto"/>
+            </w:pPr>
+            <w:r>
+              <w:t>Unit tests for zone lookup &amp; suggestion logic</w:t>
+            </w:r>
+          </w:p>
+        </w:tc>
+        <w:tc>
+          <w:tcPr>
+            <w:tcW w:w="1114" w:type="dxa"/>
+            <w:tcBorders>
+              <w:top w:val="single" w:sz="4" w:space="0" w:color="auto"/>
+              <w:left w:val="single" w:sz="4" w:space="0" w:color="auto"/>
+              <w:bottom w:val="single" w:sz="4" w:space="0" w:color="auto"/>
+              <w:right w:val="single" w:sz="4" w:space="0" w:color="auto"/>
+            </w:tcBorders>
+            <w:hideMark/>
+          </w:tcPr>
+          <w:p>
+            <w:pPr>
+              <w:spacing w:after="160" w:line="278" w:lineRule="auto"/>
+            </w:pPr>
+            <w:r>
+              <w:t>4</w:t>
+            </w:r>
+          </w:p>
+        </w:tc>
+        <w:tc>
+          <w:tcPr>
+            <w:tcW w:w="1352" w:type="dxa"/>
+            <w:tcBorders>
+              <w:top w:val="single" w:sz="4" w:space="0" w:color="auto"/>
+              <w:left w:val="single" w:sz="4" w:space="0" w:color="auto"/>
+              <w:bottom w:val="single" w:sz="4" w:space="0" w:color="auto"/>
+              <w:right w:val="single" w:sz="4" w:space="0" w:color="auto"/>
+            </w:tcBorders>
+            <w:hideMark/>
+          </w:tcPr>
+          <w:p>
+            <w:pPr>
+              <w:spacing w:after="160" w:line="278" w:lineRule="auto"/>
+            </w:pPr>
             <w:r>
               <w:t>Phase 1</w:t>
             </w:r>
@@ -852,9 +1232,1030 @@
         </w:tc>
         <w:tc>
           <w:tcPr>
-            <w:tcW w:w="1489" w:type="dxa"/>
-          </w:tcPr>
-          <w:p/>
+            <w:tcW w:w="1528" w:type="dxa"/>
+            <w:tcBorders>
+              <w:top w:val="single" w:sz="4" w:space="0" w:color="auto"/>
+              <w:left w:val="single" w:sz="4" w:space="0" w:color="auto"/>
+              <w:bottom w:val="single" w:sz="4" w:space="0" w:color="auto"/>
+              <w:right w:val="single" w:sz="4" w:space="0" w:color="auto"/>
+            </w:tcBorders>
+            <w:hideMark/>
+          </w:tcPr>
+          <w:p>
+            <w:pPr>
+              <w:spacing w:after="160" w:line="278" w:lineRule="auto"/>
+            </w:pPr>
+            <w:r>
+              <w:t>No</w:t>
+            </w:r>
+          </w:p>
+        </w:tc>
+      </w:tr>
+      <w:tr>
+        <w:tc>
+          <w:tcPr>
+            <w:tcW w:w="5811" w:type="dxa"/>
+            <w:tcBorders>
+              <w:top w:val="single" w:sz="4" w:space="0" w:color="auto"/>
+              <w:left w:val="single" w:sz="4" w:space="0" w:color="auto"/>
+              <w:bottom w:val="single" w:sz="4" w:space="0" w:color="auto"/>
+              <w:right w:val="single" w:sz="4" w:space="0" w:color="auto"/>
+            </w:tcBorders>
+            <w:hideMark/>
+          </w:tcPr>
+          <w:p>
+            <w:pPr>
+              <w:spacing w:after="160" w:line="278" w:lineRule="auto"/>
+            </w:pPr>
+            <w:r>
+              <w:t>Phase 1 demo / integration check</w:t>
+            </w:r>
+          </w:p>
+        </w:tc>
+        <w:tc>
+          <w:tcPr>
+            <w:tcW w:w="1114" w:type="dxa"/>
+            <w:tcBorders>
+              <w:top w:val="single" w:sz="4" w:space="0" w:color="auto"/>
+              <w:left w:val="single" w:sz="4" w:space="0" w:color="auto"/>
+              <w:bottom w:val="single" w:sz="4" w:space="0" w:color="auto"/>
+              <w:right w:val="single" w:sz="4" w:space="0" w:color="auto"/>
+            </w:tcBorders>
+            <w:hideMark/>
+          </w:tcPr>
+          <w:p>
+            <w:pPr>
+              <w:spacing w:after="160" w:line="278" w:lineRule="auto"/>
+            </w:pPr>
+            <w:r>
+              <w:t>2</w:t>
+            </w:r>
+          </w:p>
+        </w:tc>
+        <w:tc>
+          <w:tcPr>
+            <w:tcW w:w="1352" w:type="dxa"/>
+            <w:tcBorders>
+              <w:top w:val="single" w:sz="4" w:space="0" w:color="auto"/>
+              <w:left w:val="single" w:sz="4" w:space="0" w:color="auto"/>
+              <w:bottom w:val="single" w:sz="4" w:space="0" w:color="auto"/>
+              <w:right w:val="single" w:sz="4" w:space="0" w:color="auto"/>
+            </w:tcBorders>
+            <w:hideMark/>
+          </w:tcPr>
+          <w:p>
+            <w:pPr>
+              <w:spacing w:after="160" w:line="278" w:lineRule="auto"/>
+            </w:pPr>
+            <w:r>
+              <w:t>Phase 1</w:t>
+            </w:r>
+          </w:p>
+        </w:tc>
+        <w:tc>
+          <w:tcPr>
+            <w:tcW w:w="1528" w:type="dxa"/>
+            <w:tcBorders>
+              <w:top w:val="single" w:sz="4" w:space="0" w:color="auto"/>
+              <w:left w:val="single" w:sz="4" w:space="0" w:color="auto"/>
+              <w:bottom w:val="single" w:sz="4" w:space="0" w:color="auto"/>
+              <w:right w:val="single" w:sz="4" w:space="0" w:color="auto"/>
+            </w:tcBorders>
+            <w:hideMark/>
+          </w:tcPr>
+          <w:p>
+            <w:pPr>
+              <w:spacing w:after="160" w:line="278" w:lineRule="auto"/>
+            </w:pPr>
+            <w:r>
+              <w:t>Yes</w:t>
+            </w:r>
+          </w:p>
+        </w:tc>
+      </w:tr>
+    </w:tbl>
+    <w:p/>
+    <w:p>
+      <w:r>
+        <w:rPr>
+          <w:b/>
+        </w:rPr>
+        <w:t>Phase 2: Core Features &amp; Polish</w:t>
+      </w:r>
+    </w:p>
+    <w:tbl>
+      <w:tblPr>
+        <w:tblStyle w:val="TableGrid"/>
+        <w:tblW w:w="9635" w:type="dxa"/>
+        <w:tblLook w:val="04A0" w:firstRow="1" w:lastRow="0" w:firstColumn="1" w:lastColumn="0" w:noHBand="0" w:noVBand="1"/>
+      </w:tblPr>
+      <w:tblGrid>
+        <w:gridCol w:w="5665"/>
+        <w:gridCol w:w="1170"/>
+        <w:gridCol w:w="1175"/>
+        <w:gridCol w:w="1625"/>
+      </w:tblGrid>
+      <w:tr>
+        <w:tc>
+          <w:tcPr>
+            <w:tcW w:w="5665" w:type="dxa"/>
+            <w:tcBorders>
+              <w:top w:val="single" w:sz="4" w:space="0" w:color="auto"/>
+              <w:left w:val="single" w:sz="4" w:space="0" w:color="auto"/>
+              <w:bottom w:val="single" w:sz="4" w:space="0" w:color="auto"/>
+              <w:right w:val="single" w:sz="4" w:space="0" w:color="auto"/>
+            </w:tcBorders>
+            <w:hideMark/>
+          </w:tcPr>
+          <w:p>
+            <w:pPr>
+              <w:spacing w:after="160" w:line="278" w:lineRule="auto"/>
+            </w:pPr>
+            <w:r>
+              <w:t>Milestone</w:t>
+            </w:r>
+          </w:p>
+        </w:tc>
+        <w:tc>
+          <w:tcPr>
+            <w:tcW w:w="1170" w:type="dxa"/>
+            <w:tcBorders>
+              <w:top w:val="single" w:sz="4" w:space="0" w:color="auto"/>
+              <w:left w:val="single" w:sz="4" w:space="0" w:color="auto"/>
+              <w:bottom w:val="single" w:sz="4" w:space="0" w:color="auto"/>
+              <w:right w:val="single" w:sz="4" w:space="0" w:color="auto"/>
+            </w:tcBorders>
+            <w:hideMark/>
+          </w:tcPr>
+          <w:p>
+            <w:pPr>
+              <w:spacing w:after="160" w:line="278" w:lineRule="auto"/>
+            </w:pPr>
+            <w:r>
+              <w:t>Duration (days)</w:t>
+            </w:r>
+          </w:p>
+        </w:tc>
+        <w:tc>
+          <w:tcPr>
+            <w:tcW w:w="1175" w:type="dxa"/>
+            <w:tcBorders>
+              <w:top w:val="single" w:sz="4" w:space="0" w:color="auto"/>
+              <w:left w:val="single" w:sz="4" w:space="0" w:color="auto"/>
+              <w:bottom w:val="single" w:sz="4" w:space="0" w:color="auto"/>
+              <w:right w:val="single" w:sz="4" w:space="0" w:color="auto"/>
+            </w:tcBorders>
+            <w:hideMark/>
+          </w:tcPr>
+          <w:p>
+            <w:pPr>
+              <w:spacing w:after="160" w:line="278" w:lineRule="auto"/>
+            </w:pPr>
+            <w:r>
+              <w:t>Release</w:t>
+            </w:r>
+          </w:p>
+        </w:tc>
+        <w:tc>
+          <w:tcPr>
+            <w:tcW w:w="1625" w:type="dxa"/>
+            <w:tcBorders>
+              <w:top w:val="single" w:sz="4" w:space="0" w:color="auto"/>
+              <w:left w:val="single" w:sz="4" w:space="0" w:color="auto"/>
+              <w:bottom w:val="single" w:sz="4" w:space="0" w:color="auto"/>
+              <w:right w:val="single" w:sz="4" w:space="0" w:color="auto"/>
+            </w:tcBorders>
+            <w:hideMark/>
+          </w:tcPr>
+          <w:p>
+            <w:pPr>
+              <w:spacing w:after="160" w:line="278" w:lineRule="auto"/>
+            </w:pPr>
+            <w:r>
+              <w:t>Deliverable?</w:t>
+            </w:r>
+          </w:p>
+        </w:tc>
+      </w:tr>
+      <w:tr>
+        <w:tc>
+          <w:tcPr>
+            <w:tcW w:w="5665" w:type="dxa"/>
+            <w:tcBorders>
+              <w:top w:val="single" w:sz="4" w:space="0" w:color="auto"/>
+              <w:left w:val="single" w:sz="4" w:space="0" w:color="auto"/>
+              <w:bottom w:val="single" w:sz="4" w:space="0" w:color="auto"/>
+              <w:right w:val="single" w:sz="4" w:space="0" w:color="auto"/>
+            </w:tcBorders>
+            <w:hideMark/>
+          </w:tcPr>
+          <w:p>
+            <w:pPr>
+              <w:spacing w:after="160" w:line="278" w:lineRule="auto"/>
+            </w:pPr>
+            <w:r>
+              <w:t>User login/registration</w:t>
+            </w:r>
+          </w:p>
+        </w:tc>
+        <w:tc>
+          <w:tcPr>
+            <w:tcW w:w="1170" w:type="dxa"/>
+            <w:tcBorders>
+              <w:top w:val="single" w:sz="4" w:space="0" w:color="auto"/>
+              <w:left w:val="single" w:sz="4" w:space="0" w:color="auto"/>
+              <w:bottom w:val="single" w:sz="4" w:space="0" w:color="auto"/>
+              <w:right w:val="single" w:sz="4" w:space="0" w:color="auto"/>
+            </w:tcBorders>
+            <w:hideMark/>
+          </w:tcPr>
+          <w:p>
+            <w:pPr>
+              <w:spacing w:after="160" w:line="278" w:lineRule="auto"/>
+            </w:pPr>
+            <w:r>
+              <w:t>6</w:t>
+            </w:r>
+          </w:p>
+        </w:tc>
+        <w:tc>
+          <w:tcPr>
+            <w:tcW w:w="1175" w:type="dxa"/>
+            <w:tcBorders>
+              <w:top w:val="single" w:sz="4" w:space="0" w:color="auto"/>
+              <w:left w:val="single" w:sz="4" w:space="0" w:color="auto"/>
+              <w:bottom w:val="single" w:sz="4" w:space="0" w:color="auto"/>
+              <w:right w:val="single" w:sz="4" w:space="0" w:color="auto"/>
+            </w:tcBorders>
+            <w:hideMark/>
+          </w:tcPr>
+          <w:p>
+            <w:pPr>
+              <w:spacing w:after="160" w:line="278" w:lineRule="auto"/>
+            </w:pPr>
+            <w:r>
+              <w:t>Phase 2</w:t>
+            </w:r>
+          </w:p>
+        </w:tc>
+        <w:tc>
+          <w:tcPr>
+            <w:tcW w:w="1625" w:type="dxa"/>
+            <w:tcBorders>
+              <w:top w:val="single" w:sz="4" w:space="0" w:color="auto"/>
+              <w:left w:val="single" w:sz="4" w:space="0" w:color="auto"/>
+              <w:bottom w:val="single" w:sz="4" w:space="0" w:color="auto"/>
+              <w:right w:val="single" w:sz="4" w:space="0" w:color="auto"/>
+            </w:tcBorders>
+            <w:hideMark/>
+          </w:tcPr>
+          <w:p>
+            <w:pPr>
+              <w:spacing w:after="160" w:line="278" w:lineRule="auto"/>
+            </w:pPr>
+            <w:r>
+              <w:t>No</w:t>
+            </w:r>
+          </w:p>
+        </w:tc>
+      </w:tr>
+      <w:tr>
+        <w:tc>
+          <w:tcPr>
+            <w:tcW w:w="5665" w:type="dxa"/>
+            <w:tcBorders>
+              <w:top w:val="single" w:sz="4" w:space="0" w:color="auto"/>
+              <w:left w:val="single" w:sz="4" w:space="0" w:color="auto"/>
+              <w:bottom w:val="single" w:sz="4" w:space="0" w:color="auto"/>
+              <w:right w:val="single" w:sz="4" w:space="0" w:color="auto"/>
+            </w:tcBorders>
+            <w:hideMark/>
+          </w:tcPr>
+          <w:p>
+            <w:pPr>
+              <w:spacing w:after="160" w:line="278" w:lineRule="auto"/>
+            </w:pPr>
+            <w:r>
+              <w:t>Severe weather alert logic</w:t>
+            </w:r>
+          </w:p>
+        </w:tc>
+        <w:tc>
+          <w:tcPr>
+            <w:tcW w:w="1170" w:type="dxa"/>
+            <w:tcBorders>
+              <w:top w:val="single" w:sz="4" w:space="0" w:color="auto"/>
+              <w:left w:val="single" w:sz="4" w:space="0" w:color="auto"/>
+              <w:bottom w:val="single" w:sz="4" w:space="0" w:color="auto"/>
+              <w:right w:val="single" w:sz="4" w:space="0" w:color="auto"/>
+            </w:tcBorders>
+            <w:hideMark/>
+          </w:tcPr>
+          <w:p>
+            <w:pPr>
+              <w:spacing w:after="160" w:line="278" w:lineRule="auto"/>
+            </w:pPr>
+            <w:r>
+              <w:t>5</w:t>
+            </w:r>
+          </w:p>
+        </w:tc>
+        <w:tc>
+          <w:tcPr>
+            <w:tcW w:w="1175" w:type="dxa"/>
+            <w:tcBorders>
+              <w:top w:val="single" w:sz="4" w:space="0" w:color="auto"/>
+              <w:left w:val="single" w:sz="4" w:space="0" w:color="auto"/>
+              <w:bottom w:val="single" w:sz="4" w:space="0" w:color="auto"/>
+              <w:right w:val="single" w:sz="4" w:space="0" w:color="auto"/>
+            </w:tcBorders>
+            <w:hideMark/>
+          </w:tcPr>
+          <w:p>
+            <w:pPr>
+              <w:spacing w:after="160" w:line="278" w:lineRule="auto"/>
+            </w:pPr>
+            <w:r>
+              <w:t>Phase 2</w:t>
+            </w:r>
+          </w:p>
+        </w:tc>
+        <w:tc>
+          <w:tcPr>
+            <w:tcW w:w="1625" w:type="dxa"/>
+            <w:tcBorders>
+              <w:top w:val="single" w:sz="4" w:space="0" w:color="auto"/>
+              <w:left w:val="single" w:sz="4" w:space="0" w:color="auto"/>
+              <w:bottom w:val="single" w:sz="4" w:space="0" w:color="auto"/>
+              <w:right w:val="single" w:sz="4" w:space="0" w:color="auto"/>
+            </w:tcBorders>
+            <w:hideMark/>
+          </w:tcPr>
+          <w:p>
+            <w:pPr>
+              <w:spacing w:after="160" w:line="278" w:lineRule="auto"/>
+            </w:pPr>
+            <w:r>
+              <w:t>No</w:t>
+            </w:r>
+          </w:p>
+        </w:tc>
+      </w:tr>
+      <w:tr>
+        <w:tc>
+          <w:tcPr>
+            <w:tcW w:w="5665" w:type="dxa"/>
+            <w:tcBorders>
+              <w:top w:val="single" w:sz="4" w:space="0" w:color="auto"/>
+              <w:left w:val="single" w:sz="4" w:space="0" w:color="auto"/>
+              <w:bottom w:val="single" w:sz="4" w:space="0" w:color="auto"/>
+              <w:right w:val="single" w:sz="4" w:space="0" w:color="auto"/>
+            </w:tcBorders>
+            <w:hideMark/>
+          </w:tcPr>
+          <w:p>
+            <w:pPr>
+              <w:spacing w:after="160" w:line="278" w:lineRule="auto"/>
+            </w:pPr>
+            <w:r>
+              <w:t>Planting calendar generator (frost dates + timeline)</w:t>
+            </w:r>
+          </w:p>
+        </w:tc>
+        <w:tc>
+          <w:tcPr>
+            <w:tcW w:w="1170" w:type="dxa"/>
+            <w:tcBorders>
+              <w:top w:val="single" w:sz="4" w:space="0" w:color="auto"/>
+              <w:left w:val="single" w:sz="4" w:space="0" w:color="auto"/>
+              <w:bottom w:val="single" w:sz="4" w:space="0" w:color="auto"/>
+              <w:right w:val="single" w:sz="4" w:space="0" w:color="auto"/>
+            </w:tcBorders>
+            <w:hideMark/>
+          </w:tcPr>
+          <w:p>
+            <w:pPr>
+              <w:spacing w:after="160" w:line="278" w:lineRule="auto"/>
+            </w:pPr>
+            <w:r>
+              <w:t>6</w:t>
+            </w:r>
+          </w:p>
+        </w:tc>
+        <w:tc>
+          <w:tcPr>
+            <w:tcW w:w="1175" w:type="dxa"/>
+            <w:tcBorders>
+              <w:top w:val="single" w:sz="4" w:space="0" w:color="auto"/>
+              <w:left w:val="single" w:sz="4" w:space="0" w:color="auto"/>
+              <w:bottom w:val="single" w:sz="4" w:space="0" w:color="auto"/>
+              <w:right w:val="single" w:sz="4" w:space="0" w:color="auto"/>
+            </w:tcBorders>
+            <w:hideMark/>
+          </w:tcPr>
+          <w:p>
+            <w:pPr>
+              <w:spacing w:after="160" w:line="278" w:lineRule="auto"/>
+            </w:pPr>
+            <w:r>
+              <w:t>Phase 2</w:t>
+            </w:r>
+          </w:p>
+        </w:tc>
+        <w:tc>
+          <w:tcPr>
+            <w:tcW w:w="1625" w:type="dxa"/>
+            <w:tcBorders>
+              <w:top w:val="single" w:sz="4" w:space="0" w:color="auto"/>
+              <w:left w:val="single" w:sz="4" w:space="0" w:color="auto"/>
+              <w:bottom w:val="single" w:sz="4" w:space="0" w:color="auto"/>
+              <w:right w:val="single" w:sz="4" w:space="0" w:color="auto"/>
+            </w:tcBorders>
+            <w:hideMark/>
+          </w:tcPr>
+          <w:p>
+            <w:pPr>
+              <w:spacing w:after="160" w:line="278" w:lineRule="auto"/>
+            </w:pPr>
+            <w:r>
+              <w:t>No</w:t>
+            </w:r>
+          </w:p>
+        </w:tc>
+      </w:tr>
+      <w:tr>
+        <w:tc>
+          <w:tcPr>
+            <w:tcW w:w="5665" w:type="dxa"/>
+            <w:tcBorders>
+              <w:top w:val="single" w:sz="4" w:space="0" w:color="auto"/>
+              <w:left w:val="single" w:sz="4" w:space="0" w:color="auto"/>
+              <w:bottom w:val="single" w:sz="4" w:space="0" w:color="auto"/>
+              <w:right w:val="single" w:sz="4" w:space="0" w:color="auto"/>
+            </w:tcBorders>
+            <w:hideMark/>
+          </w:tcPr>
+          <w:p>
+            <w:pPr>
+              <w:spacing w:after="160" w:line="278" w:lineRule="auto"/>
+            </w:pPr>
+            <w:r>
+              <w:t>Community tips/sharing feature</w:t>
+            </w:r>
+          </w:p>
+        </w:tc>
+        <w:tc>
+          <w:tcPr>
+            <w:tcW w:w="1170" w:type="dxa"/>
+            <w:tcBorders>
+              <w:top w:val="single" w:sz="4" w:space="0" w:color="auto"/>
+              <w:left w:val="single" w:sz="4" w:space="0" w:color="auto"/>
+              <w:bottom w:val="single" w:sz="4" w:space="0" w:color="auto"/>
+              <w:right w:val="single" w:sz="4" w:space="0" w:color="auto"/>
+            </w:tcBorders>
+            <w:hideMark/>
+          </w:tcPr>
+          <w:p>
+            <w:pPr>
+              <w:spacing w:after="160" w:line="278" w:lineRule="auto"/>
+            </w:pPr>
+            <w:r>
+              <w:t>6</w:t>
+            </w:r>
+          </w:p>
+        </w:tc>
+        <w:tc>
+          <w:tcPr>
+            <w:tcW w:w="1175" w:type="dxa"/>
+            <w:tcBorders>
+              <w:top w:val="single" w:sz="4" w:space="0" w:color="auto"/>
+              <w:left w:val="single" w:sz="4" w:space="0" w:color="auto"/>
+              <w:bottom w:val="single" w:sz="4" w:space="0" w:color="auto"/>
+              <w:right w:val="single" w:sz="4" w:space="0" w:color="auto"/>
+            </w:tcBorders>
+            <w:hideMark/>
+          </w:tcPr>
+          <w:p>
+            <w:pPr>
+              <w:spacing w:after="160" w:line="278" w:lineRule="auto"/>
+            </w:pPr>
+            <w:r>
+              <w:t>Phase 2</w:t>
+            </w:r>
+          </w:p>
+        </w:tc>
+        <w:tc>
+          <w:tcPr>
+            <w:tcW w:w="1625" w:type="dxa"/>
+            <w:tcBorders>
+              <w:top w:val="single" w:sz="4" w:space="0" w:color="auto"/>
+              <w:left w:val="single" w:sz="4" w:space="0" w:color="auto"/>
+              <w:bottom w:val="single" w:sz="4" w:space="0" w:color="auto"/>
+              <w:right w:val="single" w:sz="4" w:space="0" w:color="auto"/>
+            </w:tcBorders>
+            <w:hideMark/>
+          </w:tcPr>
+          <w:p>
+            <w:pPr>
+              <w:spacing w:after="160" w:line="278" w:lineRule="auto"/>
+            </w:pPr>
+            <w:r>
+              <w:t>No</w:t>
+            </w:r>
+          </w:p>
+        </w:tc>
+      </w:tr>
+      <w:tr>
+        <w:tc>
+          <w:tcPr>
+            <w:tcW w:w="5665" w:type="dxa"/>
+            <w:tcBorders>
+              <w:top w:val="single" w:sz="4" w:space="0" w:color="auto"/>
+              <w:left w:val="single" w:sz="4" w:space="0" w:color="auto"/>
+              <w:bottom w:val="single" w:sz="4" w:space="0" w:color="auto"/>
+              <w:right w:val="single" w:sz="4" w:space="0" w:color="auto"/>
+            </w:tcBorders>
+            <w:hideMark/>
+          </w:tcPr>
+          <w:p>
+            <w:pPr>
+              <w:spacing w:after="160" w:line="278" w:lineRule="auto"/>
+            </w:pPr>
+            <w:r>
+              <w:t>Companion planting checker (stretch)</w:t>
+            </w:r>
+          </w:p>
+        </w:tc>
+        <w:tc>
+          <w:tcPr>
+            <w:tcW w:w="1170" w:type="dxa"/>
+            <w:tcBorders>
+              <w:top w:val="single" w:sz="4" w:space="0" w:color="auto"/>
+              <w:left w:val="single" w:sz="4" w:space="0" w:color="auto"/>
+              <w:bottom w:val="single" w:sz="4" w:space="0" w:color="auto"/>
+              <w:right w:val="single" w:sz="4" w:space="0" w:color="auto"/>
+            </w:tcBorders>
+            <w:hideMark/>
+          </w:tcPr>
+          <w:p>
+            <w:pPr>
+              <w:spacing w:after="160" w:line="278" w:lineRule="auto"/>
+            </w:pPr>
+            <w:r>
+              <w:t>5</w:t>
+            </w:r>
+          </w:p>
+        </w:tc>
+        <w:tc>
+          <w:tcPr>
+            <w:tcW w:w="1175" w:type="dxa"/>
+            <w:tcBorders>
+              <w:top w:val="single" w:sz="4" w:space="0" w:color="auto"/>
+              <w:left w:val="single" w:sz="4" w:space="0" w:color="auto"/>
+              <w:bottom w:val="single" w:sz="4" w:space="0" w:color="auto"/>
+              <w:right w:val="single" w:sz="4" w:space="0" w:color="auto"/>
+            </w:tcBorders>
+            <w:hideMark/>
+          </w:tcPr>
+          <w:p>
+            <w:pPr>
+              <w:spacing w:after="160" w:line="278" w:lineRule="auto"/>
+            </w:pPr>
+            <w:r>
+              <w:t>Phase 2</w:t>
+            </w:r>
+          </w:p>
+        </w:tc>
+        <w:tc>
+          <w:tcPr>
+            <w:tcW w:w="1625" w:type="dxa"/>
+            <w:tcBorders>
+              <w:top w:val="single" w:sz="4" w:space="0" w:color="auto"/>
+              <w:left w:val="single" w:sz="4" w:space="0" w:color="auto"/>
+              <w:bottom w:val="single" w:sz="4" w:space="0" w:color="auto"/>
+              <w:right w:val="single" w:sz="4" w:space="0" w:color="auto"/>
+            </w:tcBorders>
+            <w:hideMark/>
+          </w:tcPr>
+          <w:p>
+            <w:pPr>
+              <w:spacing w:after="160" w:line="278" w:lineRule="auto"/>
+            </w:pPr>
+            <w:r>
+              <w:t>No</w:t>
+            </w:r>
+          </w:p>
+        </w:tc>
+      </w:tr>
+      <w:tr>
+        <w:tc>
+          <w:tcPr>
+            <w:tcW w:w="5665" w:type="dxa"/>
+            <w:tcBorders>
+              <w:top w:val="single" w:sz="4" w:space="0" w:color="auto"/>
+              <w:left w:val="single" w:sz="4" w:space="0" w:color="auto"/>
+              <w:bottom w:val="single" w:sz="4" w:space="0" w:color="auto"/>
+              <w:right w:val="single" w:sz="4" w:space="0" w:color="auto"/>
+            </w:tcBorders>
+            <w:hideMark/>
+          </w:tcPr>
+          <w:p>
+            <w:pPr>
+              <w:spacing w:after="160" w:line="278" w:lineRule="auto"/>
+            </w:pPr>
+            <w:r>
+              <w:t>Sun exposure input refinement (stretch)</w:t>
+            </w:r>
+          </w:p>
+        </w:tc>
+        <w:tc>
+          <w:tcPr>
+            <w:tcW w:w="1170" w:type="dxa"/>
+            <w:tcBorders>
+              <w:top w:val="single" w:sz="4" w:space="0" w:color="auto"/>
+              <w:left w:val="single" w:sz="4" w:space="0" w:color="auto"/>
+              <w:bottom w:val="single" w:sz="4" w:space="0" w:color="auto"/>
+              <w:right w:val="single" w:sz="4" w:space="0" w:color="auto"/>
+            </w:tcBorders>
+            <w:hideMark/>
+          </w:tcPr>
+          <w:p>
+            <w:pPr>
+              <w:spacing w:after="160" w:line="278" w:lineRule="auto"/>
+            </w:pPr>
+            <w:r>
+              <w:t>3</w:t>
+            </w:r>
+          </w:p>
+        </w:tc>
+        <w:tc>
+          <w:tcPr>
+            <w:tcW w:w="1175" w:type="dxa"/>
+            <w:tcBorders>
+              <w:top w:val="single" w:sz="4" w:space="0" w:color="auto"/>
+              <w:left w:val="single" w:sz="4" w:space="0" w:color="auto"/>
+              <w:bottom w:val="single" w:sz="4" w:space="0" w:color="auto"/>
+              <w:right w:val="single" w:sz="4" w:space="0" w:color="auto"/>
+            </w:tcBorders>
+            <w:hideMark/>
+          </w:tcPr>
+          <w:p>
+            <w:pPr>
+              <w:spacing w:after="160" w:line="278" w:lineRule="auto"/>
+            </w:pPr>
+            <w:r>
+              <w:t>Phase 2</w:t>
+            </w:r>
+          </w:p>
+        </w:tc>
+        <w:tc>
+          <w:tcPr>
+            <w:tcW w:w="1625" w:type="dxa"/>
+            <w:tcBorders>
+              <w:top w:val="single" w:sz="4" w:space="0" w:color="auto"/>
+              <w:left w:val="single" w:sz="4" w:space="0" w:color="auto"/>
+              <w:bottom w:val="single" w:sz="4" w:space="0" w:color="auto"/>
+              <w:right w:val="single" w:sz="4" w:space="0" w:color="auto"/>
+            </w:tcBorders>
+            <w:hideMark/>
+          </w:tcPr>
+          <w:p>
+            <w:pPr>
+              <w:spacing w:after="160" w:line="278" w:lineRule="auto"/>
+            </w:pPr>
+            <w:r>
+              <w:t>No</w:t>
+            </w:r>
+          </w:p>
+        </w:tc>
+      </w:tr>
+      <w:tr>
+        <w:tc>
+          <w:tcPr>
+            <w:tcW w:w="5665" w:type="dxa"/>
+            <w:tcBorders>
+              <w:top w:val="single" w:sz="4" w:space="0" w:color="auto"/>
+              <w:left w:val="single" w:sz="4" w:space="0" w:color="auto"/>
+              <w:bottom w:val="single" w:sz="4" w:space="0" w:color="auto"/>
+              <w:right w:val="single" w:sz="4" w:space="0" w:color="auto"/>
+            </w:tcBorders>
+            <w:hideMark/>
+          </w:tcPr>
+          <w:p>
+            <w:pPr>
+              <w:spacing w:after="160" w:line="278" w:lineRule="auto"/>
+            </w:pPr>
+            <w:r>
+              <w:t>Full integration testing</w:t>
+            </w:r>
+          </w:p>
+        </w:tc>
+        <w:tc>
+          <w:tcPr>
+            <w:tcW w:w="1170" w:type="dxa"/>
+            <w:tcBorders>
+              <w:top w:val="single" w:sz="4" w:space="0" w:color="auto"/>
+              <w:left w:val="single" w:sz="4" w:space="0" w:color="auto"/>
+              <w:bottom w:val="single" w:sz="4" w:space="0" w:color="auto"/>
+              <w:right w:val="single" w:sz="4" w:space="0" w:color="auto"/>
+            </w:tcBorders>
+            <w:hideMark/>
+          </w:tcPr>
+          <w:p>
+            <w:pPr>
+              <w:spacing w:after="160" w:line="278" w:lineRule="auto"/>
+            </w:pPr>
+            <w:r>
+              <w:t>5</w:t>
+            </w:r>
+          </w:p>
+        </w:tc>
+        <w:tc>
+          <w:tcPr>
+            <w:tcW w:w="1175" w:type="dxa"/>
+            <w:tcBorders>
+              <w:top w:val="single" w:sz="4" w:space="0" w:color="auto"/>
+              <w:left w:val="single" w:sz="4" w:space="0" w:color="auto"/>
+              <w:bottom w:val="single" w:sz="4" w:space="0" w:color="auto"/>
+              <w:right w:val="single" w:sz="4" w:space="0" w:color="auto"/>
+            </w:tcBorders>
+            <w:hideMark/>
+          </w:tcPr>
+          <w:p>
+            <w:pPr>
+              <w:spacing w:after="160" w:line="278" w:lineRule="auto"/>
+            </w:pPr>
+            <w:r>
+              <w:t>Phase 2</w:t>
+            </w:r>
+          </w:p>
+        </w:tc>
+        <w:tc>
+          <w:tcPr>
+            <w:tcW w:w="1625" w:type="dxa"/>
+            <w:tcBorders>
+              <w:top w:val="single" w:sz="4" w:space="0" w:color="auto"/>
+              <w:left w:val="single" w:sz="4" w:space="0" w:color="auto"/>
+              <w:bottom w:val="single" w:sz="4" w:space="0" w:color="auto"/>
+              <w:right w:val="single" w:sz="4" w:space="0" w:color="auto"/>
+            </w:tcBorders>
+            <w:hideMark/>
+          </w:tcPr>
+          <w:p>
+            <w:pPr>
+              <w:spacing w:after="160" w:line="278" w:lineRule="auto"/>
+            </w:pPr>
+            <w:r>
+              <w:t>No</w:t>
+            </w:r>
+          </w:p>
+        </w:tc>
+      </w:tr>
+      <w:tr>
+        <w:tc>
+          <w:tcPr>
+            <w:tcW w:w="5665" w:type="dxa"/>
+            <w:tcBorders>
+              <w:top w:val="single" w:sz="4" w:space="0" w:color="auto"/>
+              <w:left w:val="single" w:sz="4" w:space="0" w:color="auto"/>
+              <w:bottom w:val="single" w:sz="4" w:space="0" w:color="auto"/>
+              <w:right w:val="single" w:sz="4" w:space="0" w:color="auto"/>
+            </w:tcBorders>
+            <w:hideMark/>
+          </w:tcPr>
+          <w:p>
+            <w:pPr>
+              <w:spacing w:after="160" w:line="278" w:lineRule="auto"/>
+            </w:pPr>
+            <w:r>
+              <w:lastRenderedPageBreak/>
+              <w:t>Bug fixes &amp; polish</w:t>
+            </w:r>
+          </w:p>
+        </w:tc>
+        <w:tc>
+          <w:tcPr>
+            <w:tcW w:w="1170" w:type="dxa"/>
+            <w:tcBorders>
+              <w:top w:val="single" w:sz="4" w:space="0" w:color="auto"/>
+              <w:left w:val="single" w:sz="4" w:space="0" w:color="auto"/>
+              <w:bottom w:val="single" w:sz="4" w:space="0" w:color="auto"/>
+              <w:right w:val="single" w:sz="4" w:space="0" w:color="auto"/>
+            </w:tcBorders>
+            <w:hideMark/>
+          </w:tcPr>
+          <w:p>
+            <w:pPr>
+              <w:spacing w:after="160" w:line="278" w:lineRule="auto"/>
+            </w:pPr>
+            <w:r>
+              <w:t>5</w:t>
+            </w:r>
+          </w:p>
+        </w:tc>
+        <w:tc>
+          <w:tcPr>
+            <w:tcW w:w="1175" w:type="dxa"/>
+            <w:tcBorders>
+              <w:top w:val="single" w:sz="4" w:space="0" w:color="auto"/>
+              <w:left w:val="single" w:sz="4" w:space="0" w:color="auto"/>
+              <w:bottom w:val="single" w:sz="4" w:space="0" w:color="auto"/>
+              <w:right w:val="single" w:sz="4" w:space="0" w:color="auto"/>
+            </w:tcBorders>
+            <w:hideMark/>
+          </w:tcPr>
+          <w:p>
+            <w:pPr>
+              <w:spacing w:after="160" w:line="278" w:lineRule="auto"/>
+            </w:pPr>
+            <w:r>
+              <w:t>Phase 2</w:t>
+            </w:r>
+          </w:p>
+        </w:tc>
+        <w:tc>
+          <w:tcPr>
+            <w:tcW w:w="1625" w:type="dxa"/>
+            <w:tcBorders>
+              <w:top w:val="single" w:sz="4" w:space="0" w:color="auto"/>
+              <w:left w:val="single" w:sz="4" w:space="0" w:color="auto"/>
+              <w:bottom w:val="single" w:sz="4" w:space="0" w:color="auto"/>
+              <w:right w:val="single" w:sz="4" w:space="0" w:color="auto"/>
+            </w:tcBorders>
+            <w:hideMark/>
+          </w:tcPr>
+          <w:p>
+            <w:pPr>
+              <w:spacing w:after="160" w:line="278" w:lineRule="auto"/>
+            </w:pPr>
+            <w:r>
+              <w:t>No</w:t>
+            </w:r>
+          </w:p>
+        </w:tc>
+      </w:tr>
+      <w:tr>
+        <w:tc>
+          <w:tcPr>
+            <w:tcW w:w="5665" w:type="dxa"/>
+            <w:tcBorders>
+              <w:top w:val="single" w:sz="4" w:space="0" w:color="auto"/>
+              <w:left w:val="single" w:sz="4" w:space="0" w:color="auto"/>
+              <w:bottom w:val="single" w:sz="4" w:space="0" w:color="auto"/>
+              <w:right w:val="single" w:sz="4" w:space="0" w:color="auto"/>
+            </w:tcBorders>
+            <w:hideMark/>
+          </w:tcPr>
+          <w:p>
+            <w:pPr>
+              <w:spacing w:after="160" w:line="278" w:lineRule="auto"/>
+            </w:pPr>
+            <w:r>
+              <w:t>Final documentation &amp; user manual</w:t>
+            </w:r>
+          </w:p>
+        </w:tc>
+        <w:tc>
+          <w:tcPr>
+            <w:tcW w:w="1170" w:type="dxa"/>
+            <w:tcBorders>
+              <w:top w:val="single" w:sz="4" w:space="0" w:color="auto"/>
+              <w:left w:val="single" w:sz="4" w:space="0" w:color="auto"/>
+              <w:bottom w:val="single" w:sz="4" w:space="0" w:color="auto"/>
+              <w:right w:val="single" w:sz="4" w:space="0" w:color="auto"/>
+            </w:tcBorders>
+            <w:hideMark/>
+          </w:tcPr>
+          <w:p>
+            <w:pPr>
+              <w:spacing w:after="160" w:line="278" w:lineRule="auto"/>
+            </w:pPr>
+            <w:r>
+              <w:t>3</w:t>
+            </w:r>
+          </w:p>
+        </w:tc>
+        <w:tc>
+          <w:tcPr>
+            <w:tcW w:w="1175" w:type="dxa"/>
+            <w:tcBorders>
+              <w:top w:val="single" w:sz="4" w:space="0" w:color="auto"/>
+              <w:left w:val="single" w:sz="4" w:space="0" w:color="auto"/>
+              <w:bottom w:val="single" w:sz="4" w:space="0" w:color="auto"/>
+              <w:right w:val="single" w:sz="4" w:space="0" w:color="auto"/>
+            </w:tcBorders>
+            <w:hideMark/>
+          </w:tcPr>
+          <w:p>
+            <w:pPr>
+              <w:spacing w:after="160" w:line="278" w:lineRule="auto"/>
+            </w:pPr>
+            <w:r>
+              <w:t>Phase 2</w:t>
+            </w:r>
+          </w:p>
+        </w:tc>
+        <w:tc>
+          <w:tcPr>
+            <w:tcW w:w="1625" w:type="dxa"/>
+            <w:tcBorders>
+              <w:top w:val="single" w:sz="4" w:space="0" w:color="auto"/>
+              <w:left w:val="single" w:sz="4" w:space="0" w:color="auto"/>
+              <w:bottom w:val="single" w:sz="4" w:space="0" w:color="auto"/>
+              <w:right w:val="single" w:sz="4" w:space="0" w:color="auto"/>
+            </w:tcBorders>
+            <w:hideMark/>
+          </w:tcPr>
+          <w:p>
+            <w:pPr>
+              <w:spacing w:after="160" w:line="278" w:lineRule="auto"/>
+            </w:pPr>
+            <w:r>
+              <w:t>Yes</w:t>
+            </w:r>
+          </w:p>
+        </w:tc>
+      </w:tr>
+      <w:tr>
+        <w:tc>
+          <w:tcPr>
+            <w:tcW w:w="5665" w:type="dxa"/>
+            <w:tcBorders>
+              <w:top w:val="single" w:sz="4" w:space="0" w:color="auto"/>
+              <w:left w:val="single" w:sz="4" w:space="0" w:color="auto"/>
+              <w:bottom w:val="single" w:sz="4" w:space="0" w:color="auto"/>
+              <w:right w:val="single" w:sz="4" w:space="0" w:color="auto"/>
+            </w:tcBorders>
+            <w:hideMark/>
+          </w:tcPr>
+          <w:p>
+            <w:pPr>
+              <w:spacing w:after="160" w:line="278" w:lineRule="auto"/>
+            </w:pPr>
+            <w:r>
+              <w:t>Final demo / presentation</w:t>
+            </w:r>
+          </w:p>
+        </w:tc>
+        <w:tc>
+          <w:tcPr>
+            <w:tcW w:w="1170" w:type="dxa"/>
+            <w:tcBorders>
+              <w:top w:val="single" w:sz="4" w:space="0" w:color="auto"/>
+              <w:left w:val="single" w:sz="4" w:space="0" w:color="auto"/>
+              <w:bottom w:val="single" w:sz="4" w:space="0" w:color="auto"/>
+              <w:right w:val="single" w:sz="4" w:space="0" w:color="auto"/>
+            </w:tcBorders>
+            <w:hideMark/>
+          </w:tcPr>
+          <w:p>
+            <w:pPr>
+              <w:spacing w:after="160" w:line="278" w:lineRule="auto"/>
+            </w:pPr>
+            <w:r>
+              <w:t>2</w:t>
+            </w:r>
+          </w:p>
+        </w:tc>
+        <w:tc>
+          <w:tcPr>
+            <w:tcW w:w="1175" w:type="dxa"/>
+            <w:tcBorders>
+              <w:top w:val="single" w:sz="4" w:space="0" w:color="auto"/>
+              <w:left w:val="single" w:sz="4" w:space="0" w:color="auto"/>
+              <w:bottom w:val="single" w:sz="4" w:space="0" w:color="auto"/>
+              <w:right w:val="single" w:sz="4" w:space="0" w:color="auto"/>
+            </w:tcBorders>
+            <w:hideMark/>
+          </w:tcPr>
+          <w:p>
+            <w:pPr>
+              <w:spacing w:after="160" w:line="278" w:lineRule="auto"/>
+            </w:pPr>
+            <w:r>
+              <w:t>Phase 2</w:t>
+            </w:r>
+          </w:p>
+        </w:tc>
+        <w:tc>
+          <w:tcPr>
+            <w:tcW w:w="1625" w:type="dxa"/>
+            <w:tcBorders>
+              <w:top w:val="single" w:sz="4" w:space="0" w:color="auto"/>
+              <w:left w:val="single" w:sz="4" w:space="0" w:color="auto"/>
+              <w:bottom w:val="single" w:sz="4" w:space="0" w:color="auto"/>
+              <w:right w:val="single" w:sz="4" w:space="0" w:color="auto"/>
+            </w:tcBorders>
+            <w:hideMark/>
+          </w:tcPr>
+          <w:p>
+            <w:pPr>
+              <w:spacing w:after="160" w:line="278" w:lineRule="auto"/>
+            </w:pPr>
+            <w:r>
+              <w:t>Yes</w:t>
+            </w:r>
+          </w:p>
         </w:tc>
       </w:tr>
     </w:tbl>

</xml_diff>